<commit_message>
feat(dotbiz/settlement): PG 수수료 100% 고객 부담 — Option C Hybrid 채택
🎯 정책 전면 변경:
이전 결재 (DOTBIZ 부담 + 마진 흡수)는 마진 3.5~4% 환경에서 역마진 위험.
PG 수수료는 100% 고객 부담으로 전환.

💡 Option C Hybrid (Booking-style) 채택:
- 검색·리스트: 호텔 정가 단일가 (가격 경쟁력)
- 결제 단계: 결제수단 선택 시 PG 수수료 자동 표시
- 인보이스: 호텔 정가 + 결제 수수료 라인 분리

❌ 폐기된 옵션:
- Option A (Ratehawk 판매가 포함): 결제수단별 수수료 차이 크고 송금 고객 손해
- 흡수 모델 (이전 1·2단계 결재): 마진 잠식 불가피

📊 마진 시뮬레이션 (마진 4% 환경):
- Gross Margin 4% − ELS 0.6% − CMS 1% − PG 0% (고객 부담) = Net +2.4%
- 모든 권역 동일 (한국·대중화·동남아·SG+MY)

💳 고객 입장 — 결제수단 선택 자유:
- 송금/PayNow/FPS: 0%
- 가상계좌 (한국): 0.025%
- QR (PromptPay/VNPay/Alipay/WeChat): 0~2%
- 카드 (Stripe 등): 2~3.4%

🗓 무효 처리된 이전 결재 3건 (영구 기록):
- 2026-05-07 #1 'PG DOTBIZ 부담'
- 2026-05-08 #9 'Tier별 차등 흡수'
- 2026-05-08 #11 'PG 흡수 모델 Tier별'

산출물:
- Payment_Strategy_v3_2026-05-08.md v3.1 (PG 100% 고객 부담)
- Payment_Strategy_v3_2026-05-08.docx 재생성
- POLICY_CHANGELOG 2건 추가 (총 35건, 정책 변경 + 이전 결재 무효화)

Co-Authored-By: Claude Opus 4.7 (1M context) <noreply@anthropic.com>
</commit_message>
<xml_diff>
--- a/docs/Payment_Strategy_v3_2026-05-08.docx
+++ b/docs/Payment_Strategy_v3_2026-05-08.docx
@@ -66,7 +66,7 @@
           <w:sz w:val="20"/>
           <w:szCs w:val="20"/>
         </w:rPr>
-        <w:t xml:space="preserve">: 3.0 (실제 비즈니스 구조 반영)</w:t>
+        <w:t xml:space="preserve">: 3.1 (PG 수수료 고객 부담 정책 확정)</w:t>
       </w:r>
     </w:p>
     <w:p>
@@ -126,7 +126,7 @@
           <w:sz w:val="30"/>
           <w:szCs w:val="30"/>
         </w:rPr>
-        <w:t xml:space="preserve">🏢 비즈니스 구조 (확정)</w:t>
+        <w:t xml:space="preserve">🎯 핵심 결정 (2026-05-08 확정)</w:t>
       </w:r>
     </w:p>
     <w:p>
@@ -147,7 +147,555 @@
           <w:sz w:val="26"/>
           <w:szCs w:val="26"/>
         </w:rPr>
-        <w:t xml:space="preserve">법인 구조</w:t>
+        <w:t xml:space="preserve">💰 PG 수수료 100% 고객 부담</w:t>
+      </w:r>
+    </w:p>
+    <w:p>
+      <w:r>
+        <w:t xml:space="preserve"/>
+      </w:r>
+    </w:p>
+    <w:p>
+      <w:pPr>
+        <w:spacing w:after="80"/>
+      </w:pPr>
+      <w:r>
+        <w:rPr>
+          <w:rFonts w:ascii="Malgun Gothic" w:cs="Malgun Gothic" w:eastAsia="Malgun Gothic" w:hAnsi="Malgun Gothic"/>
+          <w:b/>
+          <w:bCs/>
+          <w:sz w:val="20"/>
+          <w:szCs w:val="20"/>
+        </w:rPr>
+        <w:t xml:space="preserve">DOTBIZ는 PG 수수료를 비용 처리하지 않음.</w:t>
+      </w:r>
+      <w:r>
+        <w:rPr>
+          <w:rFonts w:ascii="Malgun Gothic" w:cs="Malgun Gothic" w:eastAsia="Malgun Gothic" w:hAnsi="Malgun Gothic"/>
+          <w:sz w:val="20"/>
+          <w:szCs w:val="20"/>
+        </w:rPr>
+        <w:t xml:space="preserve"> 모든 결제 수수료는 고객이 부담.</w:t>
+      </w:r>
+    </w:p>
+    <w:p>
+      <w:r>
+        <w:t xml:space="preserve"/>
+      </w:r>
+    </w:p>
+    <w:tbl>
+      <w:tblPr>
+        <w:tblW w:type="dxa" w:w="9360"/>
+        <w:tblBorders>
+          <w:top w:val="single" w:color="auto" w:sz="4"/>
+          <w:left w:val="single" w:color="auto" w:sz="4"/>
+          <w:bottom w:val="single" w:color="auto" w:sz="4"/>
+          <w:right w:val="single" w:color="auto" w:sz="4"/>
+          <w:insideH w:val="single" w:color="auto" w:sz="4"/>
+          <w:insideV w:val="single" w:color="auto" w:sz="4"/>
+        </w:tblBorders>
+      </w:tblPr>
+      <w:tblGrid>
+        <w:gridCol w:w="4680"/>
+        <w:gridCol w:w="4680"/>
+      </w:tblGrid>
+      <w:tr>
+        <w:trPr>
+          <w:tblHeader/>
+        </w:trPr>
+        <w:tc>
+          <w:tcPr>
+            <w:tcW w:type="dxa" w:w="4680"/>
+            <w:tcBorders>
+              <w:top w:val="single" w:color="BFBFBF" w:sz="4"/>
+              <w:left w:val="single" w:color="BFBFBF" w:sz="4"/>
+              <w:bottom w:val="single" w:color="BFBFBF" w:sz="4"/>
+              <w:right w:val="single" w:color="BFBFBF" w:sz="4"/>
+            </w:tcBorders>
+            <w:shd w:fill="D5E8F0" w:val="clear"/>
+            <w:tcMar>
+              <w:top w:type="dxa" w:w="80"/>
+              <w:left w:type="dxa" w:w="120"/>
+              <w:bottom w:type="dxa" w:w="80"/>
+              <w:right w:type="dxa" w:w="120"/>
+            </w:tcMar>
+          </w:tcPr>
+          <w:p>
+            <w:r>
+              <w:rPr>
+                <w:b/>
+                <w:bCs/>
+              </w:rPr>
+            </w:r>
+          </w:p>
+        </w:tc>
+        <w:tc>
+          <w:tcPr>
+            <w:tcW w:type="dxa" w:w="4680"/>
+            <w:tcBorders>
+              <w:top w:val="single" w:color="BFBFBF" w:sz="4"/>
+              <w:left w:val="single" w:color="BFBFBF" w:sz="4"/>
+              <w:bottom w:val="single" w:color="BFBFBF" w:sz="4"/>
+              <w:right w:val="single" w:color="BFBFBF" w:sz="4"/>
+            </w:tcBorders>
+            <w:shd w:fill="D5E8F0" w:val="clear"/>
+            <w:tcMar>
+              <w:top w:type="dxa" w:w="80"/>
+              <w:left w:type="dxa" w:w="120"/>
+              <w:bottom w:type="dxa" w:w="80"/>
+              <w:right w:type="dxa" w:w="120"/>
+            </w:tcMar>
+          </w:tcPr>
+          <w:p>
+            <w:r>
+              <w:rPr>
+                <w:b/>
+                <w:bCs/>
+              </w:rPr>
+            </w:r>
+          </w:p>
+        </w:tc>
+      </w:tr>
+      <w:tr>
+        <w:tc>
+          <w:tcPr>
+            <w:tcW w:type="dxa" w:w="4680"/>
+            <w:tcBorders>
+              <w:top w:val="single" w:color="BFBFBF" w:sz="4"/>
+              <w:left w:val="single" w:color="BFBFBF" w:sz="4"/>
+              <w:bottom w:val="single" w:color="BFBFBF" w:sz="4"/>
+              <w:right w:val="single" w:color="BFBFBF" w:sz="4"/>
+            </w:tcBorders>
+            <w:tcMar>
+              <w:top w:type="dxa" w:w="80"/>
+              <w:left w:type="dxa" w:w="120"/>
+              <w:bottom w:type="dxa" w:w="80"/>
+              <w:right w:type="dxa" w:w="120"/>
+            </w:tcMar>
+          </w:tcPr>
+          <w:p>
+            <w:r>
+              <w:rPr>
+                <w:rFonts w:ascii="Malgun Gothic" w:cs="Malgun Gothic" w:eastAsia="Malgun Gothic" w:hAnsi="Malgun Gothic"/>
+                <w:sz w:val="20"/>
+                <w:szCs w:val="20"/>
+              </w:rPr>
+              <w:t xml:space="preserve">PG 수수료 부담 주체</w:t>
+            </w:r>
+          </w:p>
+        </w:tc>
+        <w:tc>
+          <w:tcPr>
+            <w:tcW w:type="dxa" w:w="4680"/>
+            <w:tcBorders>
+              <w:top w:val="single" w:color="BFBFBF" w:sz="4"/>
+              <w:left w:val="single" w:color="BFBFBF" w:sz="4"/>
+              <w:bottom w:val="single" w:color="BFBFBF" w:sz="4"/>
+              <w:right w:val="single" w:color="BFBFBF" w:sz="4"/>
+            </w:tcBorders>
+            <w:tcMar>
+              <w:top w:type="dxa" w:w="80"/>
+              <w:left w:type="dxa" w:w="120"/>
+              <w:bottom w:type="dxa" w:w="80"/>
+              <w:right w:type="dxa" w:w="120"/>
+            </w:tcMar>
+          </w:tcPr>
+          <w:p>
+            <w:r>
+              <w:rPr>
+                <w:rFonts w:ascii="Malgun Gothic" w:cs="Malgun Gothic" w:eastAsia="Malgun Gothic" w:hAnsi="Malgun Gothic"/>
+                <w:b/>
+                <w:bCs/>
+                <w:sz w:val="20"/>
+                <w:szCs w:val="20"/>
+              </w:rPr>
+              <w:t xml:space="preserve">고객 100%</w:t>
+            </w:r>
+          </w:p>
+        </w:tc>
+      </w:tr>
+      <w:tr>
+        <w:tc>
+          <w:tcPr>
+            <w:tcW w:type="dxa" w:w="4680"/>
+            <w:tcBorders>
+              <w:top w:val="single" w:color="BFBFBF" w:sz="4"/>
+              <w:left w:val="single" w:color="BFBFBF" w:sz="4"/>
+              <w:bottom w:val="single" w:color="BFBFBF" w:sz="4"/>
+              <w:right w:val="single" w:color="BFBFBF" w:sz="4"/>
+            </w:tcBorders>
+            <w:tcMar>
+              <w:top w:type="dxa" w:w="80"/>
+              <w:left w:type="dxa" w:w="120"/>
+              <w:bottom w:type="dxa" w:w="80"/>
+              <w:right w:type="dxa" w:w="120"/>
+            </w:tcMar>
+          </w:tcPr>
+          <w:p>
+            <w:r>
+              <w:rPr>
+                <w:rFonts w:ascii="Malgun Gothic" w:cs="Malgun Gothic" w:eastAsia="Malgun Gothic" w:hAnsi="Malgun Gothic"/>
+                <w:sz w:val="20"/>
+                <w:szCs w:val="20"/>
+              </w:rPr>
+              <w:t xml:space="preserve">DOTBIZ 흡수</w:t>
+            </w:r>
+          </w:p>
+        </w:tc>
+        <w:tc>
+          <w:tcPr>
+            <w:tcW w:type="dxa" w:w="4680"/>
+            <w:tcBorders>
+              <w:top w:val="single" w:color="BFBFBF" w:sz="4"/>
+              <w:left w:val="single" w:color="BFBFBF" w:sz="4"/>
+              <w:bottom w:val="single" w:color="BFBFBF" w:sz="4"/>
+              <w:right w:val="single" w:color="BFBFBF" w:sz="4"/>
+            </w:tcBorders>
+            <w:tcMar>
+              <w:top w:type="dxa" w:w="80"/>
+              <w:left w:type="dxa" w:w="120"/>
+              <w:bottom w:type="dxa" w:w="80"/>
+              <w:right w:type="dxa" w:w="120"/>
+            </w:tcMar>
+          </w:tcPr>
+          <w:p>
+            <w:r>
+              <w:rPr>
+                <w:rFonts w:ascii="Malgun Gothic" w:cs="Malgun Gothic" w:eastAsia="Malgun Gothic" w:hAnsi="Malgun Gothic"/>
+                <w:sz w:val="20"/>
+                <w:szCs w:val="20"/>
+              </w:rPr>
+              <w:t xml:space="preserve">❌ 없음</w:t>
+            </w:r>
+          </w:p>
+        </w:tc>
+      </w:tr>
+      <w:tr>
+        <w:tc>
+          <w:tcPr>
+            <w:tcW w:type="dxa" w:w="4680"/>
+            <w:tcBorders>
+              <w:top w:val="single" w:color="BFBFBF" w:sz="4"/>
+              <w:left w:val="single" w:color="BFBFBF" w:sz="4"/>
+              <w:bottom w:val="single" w:color="BFBFBF" w:sz="4"/>
+              <w:right w:val="single" w:color="BFBFBF" w:sz="4"/>
+            </w:tcBorders>
+            <w:tcMar>
+              <w:top w:type="dxa" w:w="80"/>
+              <w:left w:type="dxa" w:w="120"/>
+              <w:bottom w:type="dxa" w:w="80"/>
+              <w:right w:type="dxa" w:w="120"/>
+            </w:tcMar>
+          </w:tcPr>
+          <w:p>
+            <w:r>
+              <w:rPr>
+                <w:rFonts w:ascii="Malgun Gothic" w:cs="Malgun Gothic" w:eastAsia="Malgun Gothic" w:hAnsi="Malgun Gothic"/>
+                <w:sz w:val="20"/>
+                <w:szCs w:val="20"/>
+              </w:rPr>
+              <w:t xml:space="preserve">표시 방식</w:t>
+            </w:r>
+          </w:p>
+        </w:tc>
+        <w:tc>
+          <w:tcPr>
+            <w:tcW w:type="dxa" w:w="4680"/>
+            <w:tcBorders>
+              <w:top w:val="single" w:color="BFBFBF" w:sz="4"/>
+              <w:left w:val="single" w:color="BFBFBF" w:sz="4"/>
+              <w:bottom w:val="single" w:color="BFBFBF" w:sz="4"/>
+              <w:right w:val="single" w:color="BFBFBF" w:sz="4"/>
+            </w:tcBorders>
+            <w:tcMar>
+              <w:top w:type="dxa" w:w="80"/>
+              <w:left w:type="dxa" w:w="120"/>
+              <w:bottom w:type="dxa" w:w="80"/>
+              <w:right w:type="dxa" w:w="120"/>
+            </w:tcMar>
+          </w:tcPr>
+          <w:p>
+            <w:r>
+              <w:rPr>
+                <w:rFonts w:ascii="Malgun Gothic" w:cs="Malgun Gothic" w:eastAsia="Malgun Gothic" w:hAnsi="Malgun Gothic"/>
+                <w:b/>
+                <w:bCs/>
+                <w:sz w:val="20"/>
+                <w:szCs w:val="20"/>
+              </w:rPr>
+              <w:t xml:space="preserve">Option C — Hybrid 분리</w:t>
+            </w:r>
+            <w:r>
+              <w:rPr>
+                <w:rFonts w:ascii="Malgun Gothic" w:cs="Malgun Gothic" w:eastAsia="Malgun Gothic" w:hAnsi="Malgun Gothic"/>
+                <w:sz w:val="20"/>
+                <w:szCs w:val="20"/>
+              </w:rPr>
+              <w:t xml:space="preserve"> (Booking-style)</w:t>
+            </w:r>
+          </w:p>
+        </w:tc>
+      </w:tr>
+    </w:tbl>
+    <w:p>
+      <w:r>
+        <w:t xml:space="preserve"/>
+      </w:r>
+    </w:p>
+    <w:p>
+      <w:r>
+        <w:t xml:space="preserve"/>
+      </w:r>
+    </w:p>
+    <w:p>
+      <w:pPr>
+        <w:pStyle w:val="Heading3"/>
+        <w:spacing w:after="120" w:before="240"/>
+      </w:pPr>
+      <w:r>
+        <w:rPr>
+          <w:rFonts w:ascii="Malgun Gothic" w:cs="Malgun Gothic" w:eastAsia="Malgun Gothic" w:hAnsi="Malgun Gothic"/>
+          <w:b/>
+          <w:bCs/>
+          <w:sz w:val="26"/>
+          <w:szCs w:val="26"/>
+        </w:rPr>
+        <w:t xml:space="preserve">📋 Option C 작동 방식 (Booking-style Hybrid)</w:t>
+      </w:r>
+    </w:p>
+    <w:p>
+      <w:r>
+        <w:t xml:space="preserve"/>
+      </w:r>
+    </w:p>
+    <w:p>
+      <w:pPr>
+        <w:shd w:fill="F5F5F5" w:val="clear"/>
+        <w:spacing w:after="80" w:before="80"/>
+      </w:pPr>
+      <w:r>
+        <w:rPr>
+          <w:rFonts w:ascii="Consolas" w:cs="Consolas" w:eastAsia="Consolas" w:hAnsi="Consolas"/>
+          <w:sz w:val="18"/>
+          <w:szCs w:val="18"/>
+        </w:rPr>
+        <w:t xml:space="preserve">1. 호텔 검색/리스트
+   → 표시가: 호텔 정가 (단일가, 결제수단 무관)
+2. 호텔 상세 / Booking Form
+   → 표시가: 호텔 정가 (변동 없음)
+3. 결제 단계
+   → 결제수단 선택 (송금 / 가상계좌 / 카드 / Alipay 등)
+   → 선택 즉시 수수료 자동 계산 및 표시
+   → 최종 결제 금액 = 호텔 정가 + 선택한 결제수단 수수료
+4. 인보이스 발행
+   → 라인 1: 호텔 정가
+   → 라인 2: 결제 수수료 (결제수단 명시)
+   → 합계</w:t>
+      </w:r>
+    </w:p>
+    <w:p>
+      <w:r>
+        <w:t xml:space="preserve"/>
+      </w:r>
+    </w:p>
+    <w:p>
+      <w:pPr>
+        <w:spacing w:after="80"/>
+      </w:pPr>
+      <w:r>
+        <w:rPr>
+          <w:rFonts w:ascii="Malgun Gothic" w:cs="Malgun Gothic" w:eastAsia="Malgun Gothic" w:hAnsi="Malgun Gothic"/>
+          <w:b/>
+          <w:bCs/>
+          <w:sz w:val="20"/>
+          <w:szCs w:val="20"/>
+        </w:rPr>
+        <w:t xml:space="preserve">왜 Option C인가?</w:t>
+      </w:r>
+    </w:p>
+    <w:p>
+      <w:pPr>
+        <w:pStyle w:val="ListParagraph"/>
+        <w:numPr>
+          <w:ilvl w:val="0"/>
+          <w:numId w:val="2"/>
+        </w:numPr>
+        <w:spacing w:after="60"/>
+      </w:pPr>
+      <w:r>
+        <w:rPr>
+          <w:rFonts w:ascii="Malgun Gothic" w:cs="Malgun Gothic" w:eastAsia="Malgun Gothic" w:hAnsi="Malgun Gothic"/>
+          <w:sz w:val="20"/>
+          <w:szCs w:val="20"/>
+        </w:rPr>
+        <w:t xml:space="preserve">검색·비교 단계는 깔끔한 단일가 (가격 경쟁력)</w:t>
+      </w:r>
+    </w:p>
+    <w:p>
+      <w:pPr>
+        <w:pStyle w:val="ListParagraph"/>
+        <w:numPr>
+          <w:ilvl w:val="0"/>
+          <w:numId w:val="2"/>
+        </w:numPr>
+        <w:spacing w:after="60"/>
+      </w:pPr>
+      <w:r>
+        <w:rPr>
+          <w:rFonts w:ascii="Malgun Gothic" w:cs="Malgun Gothic" w:eastAsia="Malgun Gothic" w:hAnsi="Malgun Gothic"/>
+          <w:sz w:val="20"/>
+          <w:szCs w:val="20"/>
+        </w:rPr>
+        <w:t xml:space="preserve">결제 단계는 투명 청구 (TBO 방식)</w:t>
+      </w:r>
+    </w:p>
+    <w:p>
+      <w:pPr>
+        <w:pStyle w:val="ListParagraph"/>
+        <w:numPr>
+          <w:ilvl w:val="0"/>
+          <w:numId w:val="2"/>
+        </w:numPr>
+        <w:spacing w:after="60"/>
+      </w:pPr>
+      <w:r>
+        <w:rPr>
+          <w:rFonts w:ascii="Malgun Gothic" w:cs="Malgun Gothic" w:eastAsia="Malgun Gothic" w:hAnsi="Malgun Gothic"/>
+          <w:sz w:val="20"/>
+          <w:szCs w:val="20"/>
+        </w:rPr>
+        <w:t xml:space="preserve">결제수단/권역별 수수료 차이 정확 반영</w:t>
+      </w:r>
+    </w:p>
+    <w:p>
+      <w:pPr>
+        <w:pStyle w:val="ListParagraph"/>
+        <w:numPr>
+          <w:ilvl w:val="0"/>
+          <w:numId w:val="2"/>
+        </w:numPr>
+        <w:spacing w:after="60"/>
+      </w:pPr>
+      <w:r>
+        <w:rPr>
+          <w:rFonts w:ascii="Malgun Gothic" w:cs="Malgun Gothic" w:eastAsia="Malgun Gothic" w:hAnsi="Malgun Gothic"/>
+          <w:sz w:val="20"/>
+          <w:szCs w:val="20"/>
+        </w:rPr>
+        <w:t xml:space="preserve">송금 고객은 수수료 0원 (불이익 없음)</w:t>
+      </w:r>
+    </w:p>
+    <w:p>
+      <w:pPr>
+        <w:pStyle w:val="ListParagraph"/>
+        <w:numPr>
+          <w:ilvl w:val="0"/>
+          <w:numId w:val="2"/>
+        </w:numPr>
+        <w:spacing w:after="60"/>
+      </w:pPr>
+      <w:r>
+        <w:rPr>
+          <w:rFonts w:ascii="Malgun Gothic" w:cs="Malgun Gothic" w:eastAsia="Malgun Gothic" w:hAnsi="Malgun Gothic"/>
+          <w:sz w:val="20"/>
+          <w:szCs w:val="20"/>
+        </w:rPr>
+        <w:t xml:space="preserve">인보이스 회계 명확</w:t>
+      </w:r>
+    </w:p>
+    <w:p>
+      <w:r>
+        <w:t xml:space="preserve"/>
+      </w:r>
+    </w:p>
+    <w:p>
+      <w:pPr>
+        <w:spacing w:after="80"/>
+      </w:pPr>
+      <w:r>
+        <w:rPr>
+          <w:rFonts w:ascii="Malgun Gothic" w:cs="Malgun Gothic" w:eastAsia="Malgun Gothic" w:hAnsi="Malgun Gothic"/>
+          <w:b/>
+          <w:bCs/>
+          <w:sz w:val="20"/>
+          <w:szCs w:val="20"/>
+        </w:rPr>
+        <w:t xml:space="preserve">왜 Option A (판매가 포함) 아닌가?</w:t>
+      </w:r>
+    </w:p>
+    <w:p>
+      <w:pPr>
+        <w:pStyle w:val="ListParagraph"/>
+        <w:numPr>
+          <w:ilvl w:val="0"/>
+          <w:numId w:val="2"/>
+        </w:numPr>
+        <w:spacing w:after="60"/>
+      </w:pPr>
+      <w:r>
+        <w:rPr>
+          <w:rFonts w:ascii="Malgun Gothic" w:cs="Malgun Gothic" w:eastAsia="Malgun Gothic" w:hAnsi="Malgun Gothic"/>
+          <w:sz w:val="20"/>
+          <w:szCs w:val="20"/>
+        </w:rPr>
+        <w:t xml:space="preserve">한국 가상계좌(0.025%) vs Stripe 일본(3.6%) 단일가 불가능</w:t>
+      </w:r>
+    </w:p>
+    <w:p>
+      <w:pPr>
+        <w:pStyle w:val="ListParagraph"/>
+        <w:numPr>
+          <w:ilvl w:val="0"/>
+          <w:numId w:val="2"/>
+        </w:numPr>
+        <w:spacing w:after="60"/>
+      </w:pPr>
+      <w:r>
+        <w:rPr>
+          <w:rFonts w:ascii="Malgun Gothic" w:cs="Malgun Gothic" w:eastAsia="Malgun Gothic" w:hAnsi="Malgun Gothic"/>
+          <w:sz w:val="20"/>
+          <w:szCs w:val="20"/>
+        </w:rPr>
+        <w:t xml:space="preserve">송금 결제 고객도 카드 가격 지불 → 손해 (불공정)</w:t>
+      </w:r>
+    </w:p>
+    <w:p>
+      <w:pPr>
+        <w:pStyle w:val="ListParagraph"/>
+        <w:numPr>
+          <w:ilvl w:val="0"/>
+          <w:numId w:val="2"/>
+        </w:numPr>
+        <w:spacing w:after="60"/>
+      </w:pPr>
+      <w:r>
+        <w:rPr>
+          <w:rFonts w:ascii="Malgun Gothic" w:cs="Malgun Gothic" w:eastAsia="Malgun Gothic" w:hAnsi="Malgun Gothic"/>
+          <w:sz w:val="20"/>
+          <w:szCs w:val="20"/>
+        </w:rPr>
+        <w:t xml:space="preserve">가격 비교 시 표시가 인상 불리</w:t>
+      </w:r>
+    </w:p>
+    <w:p>
+      <w:r>
+        <w:t xml:space="preserve"/>
+      </w:r>
+    </w:p>
+    <w:p>
+      <w:pPr>
+        <w:pStyle w:val="Heading3"/>
+        <w:spacing w:after="120" w:before="240"/>
+      </w:pPr>
+      <w:r>
+        <w:rPr>
+          <w:rFonts w:ascii="Malgun Gothic" w:cs="Malgun Gothic" w:eastAsia="Malgun Gothic" w:hAnsi="Malgun Gothic"/>
+          <w:b/>
+          <w:bCs/>
+          <w:sz w:val="26"/>
+          <w:szCs w:val="26"/>
+        </w:rPr>
+        <w:t xml:space="preserve">📊 비교 옵션 (참고)</w:t>
       </w:r>
     </w:p>
     <w:p>
@@ -276,32 +824,233 @@
             <w:r>
               <w:rPr>
                 <w:rFonts w:ascii="Malgun Gothic" w:cs="Malgun Gothic" w:eastAsia="Malgun Gothic" w:hAnsi="Malgun Gothic"/>
+                <w:sz w:val="20"/>
+                <w:szCs w:val="20"/>
+              </w:rPr>
+              <w:t xml:space="preserve">A. 판매가 포함 (Ratehawk)</w:t>
+            </w:r>
+          </w:p>
+        </w:tc>
+        <w:tc>
+          <w:tcPr>
+            <w:tcW w:type="dxa" w:w="3120"/>
+            <w:tcBorders>
+              <w:top w:val="single" w:color="BFBFBF" w:sz="4"/>
+              <w:left w:val="single" w:color="BFBFBF" w:sz="4"/>
+              <w:bottom w:val="single" w:color="BFBFBF" w:sz="4"/>
+              <w:right w:val="single" w:color="BFBFBF" w:sz="4"/>
+            </w:tcBorders>
+            <w:tcMar>
+              <w:top w:type="dxa" w:w="80"/>
+              <w:left w:type="dxa" w:w="120"/>
+              <w:bottom w:type="dxa" w:w="80"/>
+              <w:right w:type="dxa" w:w="120"/>
+            </w:tcMar>
+          </w:tcPr>
+          <w:p>
+            <w:r>
+              <w:rPr>
+                <w:rFonts w:ascii="Malgun Gothic" w:cs="Malgun Gothic" w:eastAsia="Malgun Gothic" w:hAnsi="Malgun Gothic"/>
+                <w:sz w:val="20"/>
+                <w:szCs w:val="20"/>
+              </w:rPr>
+              <w:t xml:space="preserve">단일가 = 호텔가 + PG</w:t>
+            </w:r>
+          </w:p>
+        </w:tc>
+        <w:tc>
+          <w:tcPr>
+            <w:tcW w:type="dxa" w:w="3120"/>
+            <w:tcBorders>
+              <w:top w:val="single" w:color="BFBFBF" w:sz="4"/>
+              <w:left w:val="single" w:color="BFBFBF" w:sz="4"/>
+              <w:bottom w:val="single" w:color="BFBFBF" w:sz="4"/>
+              <w:right w:val="single" w:color="BFBFBF" w:sz="4"/>
+            </w:tcBorders>
+            <w:tcMar>
+              <w:top w:type="dxa" w:w="80"/>
+              <w:left w:type="dxa" w:w="120"/>
+              <w:bottom w:type="dxa" w:w="80"/>
+              <w:right w:type="dxa" w:w="120"/>
+            </w:tcMar>
+          </w:tcPr>
+          <w:p>
+            <w:r>
+              <w:rPr>
+                <w:rFonts w:ascii="Malgun Gothic" w:cs="Malgun Gothic" w:eastAsia="Malgun Gothic" w:hAnsi="Malgun Gothic"/>
+                <w:sz w:val="20"/>
+                <w:szCs w:val="20"/>
+              </w:rPr>
+              <w:t xml:space="preserve">❌ 부적합</w:t>
+            </w:r>
+          </w:p>
+        </w:tc>
+      </w:tr>
+      <w:tr>
+        <w:tc>
+          <w:tcPr>
+            <w:tcW w:type="dxa" w:w="3120"/>
+            <w:tcBorders>
+              <w:top w:val="single" w:color="BFBFBF" w:sz="4"/>
+              <w:left w:val="single" w:color="BFBFBF" w:sz="4"/>
+              <w:bottom w:val="single" w:color="BFBFBF" w:sz="4"/>
+              <w:right w:val="single" w:color="BFBFBF" w:sz="4"/>
+            </w:tcBorders>
+            <w:tcMar>
+              <w:top w:type="dxa" w:w="80"/>
+              <w:left w:type="dxa" w:w="120"/>
+              <w:bottom w:type="dxa" w:w="80"/>
+              <w:right w:type="dxa" w:w="120"/>
+            </w:tcMar>
+          </w:tcPr>
+          <w:p>
+            <w:r>
+              <w:rPr>
+                <w:rFonts w:ascii="Malgun Gothic" w:cs="Malgun Gothic" w:eastAsia="Malgun Gothic" w:hAnsi="Malgun Gothic"/>
+                <w:sz w:val="20"/>
+                <w:szCs w:val="20"/>
+              </w:rPr>
+              <w:t xml:space="preserve">B. 완전 분리 (TBO)</w:t>
+            </w:r>
+          </w:p>
+        </w:tc>
+        <w:tc>
+          <w:tcPr>
+            <w:tcW w:type="dxa" w:w="3120"/>
+            <w:tcBorders>
+              <w:top w:val="single" w:color="BFBFBF" w:sz="4"/>
+              <w:left w:val="single" w:color="BFBFBF" w:sz="4"/>
+              <w:bottom w:val="single" w:color="BFBFBF" w:sz="4"/>
+              <w:right w:val="single" w:color="BFBFBF" w:sz="4"/>
+            </w:tcBorders>
+            <w:tcMar>
+              <w:top w:type="dxa" w:w="80"/>
+              <w:left w:type="dxa" w:w="120"/>
+              <w:bottom w:type="dxa" w:w="80"/>
+              <w:right w:type="dxa" w:w="120"/>
+            </w:tcMar>
+          </w:tcPr>
+          <w:p>
+            <w:r>
+              <w:rPr>
+                <w:rFonts w:ascii="Malgun Gothic" w:cs="Malgun Gothic" w:eastAsia="Malgun Gothic" w:hAnsi="Malgun Gothic"/>
+                <w:sz w:val="20"/>
+                <w:szCs w:val="20"/>
+              </w:rPr>
+              <w:t xml:space="preserve">정가 + 수수료 별도 라인 표시</w:t>
+            </w:r>
+          </w:p>
+        </w:tc>
+        <w:tc>
+          <w:tcPr>
+            <w:tcW w:type="dxa" w:w="3120"/>
+            <w:tcBorders>
+              <w:top w:val="single" w:color="BFBFBF" w:sz="4"/>
+              <w:left w:val="single" w:color="BFBFBF" w:sz="4"/>
+              <w:bottom w:val="single" w:color="BFBFBF" w:sz="4"/>
+              <w:right w:val="single" w:color="BFBFBF" w:sz="4"/>
+            </w:tcBorders>
+            <w:tcMar>
+              <w:top w:type="dxa" w:w="80"/>
+              <w:left w:type="dxa" w:w="120"/>
+              <w:bottom w:type="dxa" w:w="80"/>
+              <w:right w:type="dxa" w:w="120"/>
+            </w:tcMar>
+          </w:tcPr>
+          <w:p>
+            <w:r>
+              <w:rPr>
+                <w:rFonts w:ascii="Malgun Gothic" w:cs="Malgun Gothic" w:eastAsia="Malgun Gothic" w:hAnsi="Malgun Gothic"/>
+                <w:sz w:val="20"/>
+                <w:szCs w:val="20"/>
+              </w:rPr>
+              <w:t xml:space="preserve">🟡 결제 단계는 적용</w:t>
+            </w:r>
+          </w:p>
+        </w:tc>
+      </w:tr>
+      <w:tr>
+        <w:tc>
+          <w:tcPr>
+            <w:tcW w:type="dxa" w:w="3120"/>
+            <w:tcBorders>
+              <w:top w:val="single" w:color="BFBFBF" w:sz="4"/>
+              <w:left w:val="single" w:color="BFBFBF" w:sz="4"/>
+              <w:bottom w:val="single" w:color="BFBFBF" w:sz="4"/>
+              <w:right w:val="single" w:color="BFBFBF" w:sz="4"/>
+            </w:tcBorders>
+            <w:tcMar>
+              <w:top w:type="dxa" w:w="80"/>
+              <w:left w:type="dxa" w:w="120"/>
+              <w:bottom w:type="dxa" w:w="80"/>
+              <w:right w:type="dxa" w:w="120"/>
+            </w:tcMar>
+          </w:tcPr>
+          <w:p>
+            <w:r>
+              <w:rPr>
+                <w:rFonts w:ascii="Malgun Gothic" w:cs="Malgun Gothic" w:eastAsia="Malgun Gothic" w:hAnsi="Malgun Gothic"/>
                 <w:b/>
                 <w:bCs/>
                 <w:sz w:val="20"/>
                 <w:szCs w:val="20"/>
               </w:rPr>
-              <w:t xml:space="preserve">본사</w:t>
-            </w:r>
-          </w:p>
-        </w:tc>
-        <w:tc>
-          <w:tcPr>
-            <w:tcW w:type="dxa" w:w="3120"/>
-            <w:tcBorders>
-              <w:top w:val="single" w:color="BFBFBF" w:sz="4"/>
-              <w:left w:val="single" w:color="BFBFBF" w:sz="4"/>
-              <w:bottom w:val="single" w:color="BFBFBF" w:sz="4"/>
-              <w:right w:val="single" w:color="BFBFBF" w:sz="4"/>
-            </w:tcBorders>
-            <w:tcMar>
-              <w:top w:type="dxa" w:w="80"/>
-              <w:left w:type="dxa" w:w="120"/>
-              <w:bottom w:type="dxa" w:w="80"/>
-              <w:right w:type="dxa" w:w="120"/>
-            </w:tcMar>
-          </w:tcPr>
-          <w:p>
+              <w:t xml:space="preserve">C. Hybrid (Booking)</w:t>
+            </w:r>
+          </w:p>
+        </w:tc>
+        <w:tc>
+          <w:tcPr>
+            <w:tcW w:type="dxa" w:w="3120"/>
+            <w:tcBorders>
+              <w:top w:val="single" w:color="BFBFBF" w:sz="4"/>
+              <w:left w:val="single" w:color="BFBFBF" w:sz="4"/>
+              <w:bottom w:val="single" w:color="BFBFBF" w:sz="4"/>
+              <w:right w:val="single" w:color="BFBFBF" w:sz="4"/>
+            </w:tcBorders>
+            <w:tcMar>
+              <w:top w:type="dxa" w:w="80"/>
+              <w:left w:type="dxa" w:w="120"/>
+              <w:bottom w:type="dxa" w:w="80"/>
+              <w:right w:type="dxa" w:w="120"/>
+            </w:tcMar>
+          </w:tcPr>
+          <w:p>
+            <w:r>
+              <w:rPr>
+                <w:rFonts w:ascii="Malgun Gothic" w:cs="Malgun Gothic" w:eastAsia="Malgun Gothic" w:hAnsi="Malgun Gothic"/>
+                <w:sz w:val="20"/>
+                <w:szCs w:val="20"/>
+              </w:rPr>
+              <w:t xml:space="preserve">표시는 단일가, 결제 단계에서 분리</w:t>
+            </w:r>
+          </w:p>
+        </w:tc>
+        <w:tc>
+          <w:tcPr>
+            <w:tcW w:type="dxa" w:w="3120"/>
+            <w:tcBorders>
+              <w:top w:val="single" w:color="BFBFBF" w:sz="4"/>
+              <w:left w:val="single" w:color="BFBFBF" w:sz="4"/>
+              <w:bottom w:val="single" w:color="BFBFBF" w:sz="4"/>
+              <w:right w:val="single" w:color="BFBFBF" w:sz="4"/>
+            </w:tcBorders>
+            <w:tcMar>
+              <w:top w:type="dxa" w:w="80"/>
+              <w:left w:type="dxa" w:w="120"/>
+              <w:bottom w:type="dxa" w:w="80"/>
+              <w:right w:type="dxa" w:w="120"/>
+            </w:tcMar>
+          </w:tcPr>
+          <w:p>
+            <w:r>
+              <w:rPr>
+                <w:rFonts w:ascii="Malgun Gothic" w:cs="Malgun Gothic" w:eastAsia="Malgun Gothic" w:hAnsi="Malgun Gothic"/>
+                <w:sz w:val="20"/>
+                <w:szCs w:val="20"/>
+              </w:rPr>
+              <w:t xml:space="preserve">✅ </w:t>
+            </w:r>
             <w:r>
               <w:rPr>
                 <w:rFonts w:ascii="Malgun Gothic" w:cs="Malgun Gothic" w:eastAsia="Malgun Gothic" w:hAnsi="Malgun Gothic"/>
@@ -310,376 +1059,7 @@
                 <w:sz w:val="20"/>
                 <w:szCs w:val="20"/>
               </w:rPr>
-              <w:t xml:space="preserve">싱가포르</w:t>
-            </w:r>
-            <w:r>
-              <w:rPr>
-                <w:rFonts w:ascii="Malgun Gothic" w:cs="Malgun Gothic" w:eastAsia="Malgun Gothic" w:hAnsi="Malgun Gothic"/>
-                <w:sz w:val="20"/>
-                <w:szCs w:val="20"/>
-              </w:rPr>
-              <w:t xml:space="preserve"> (omh-sg)</w:t>
-            </w:r>
-          </w:p>
-        </w:tc>
-        <w:tc>
-          <w:tcPr>
-            <w:tcW w:type="dxa" w:w="3120"/>
-            <w:tcBorders>
-              <w:top w:val="single" w:color="BFBFBF" w:sz="4"/>
-              <w:left w:val="single" w:color="BFBFBF" w:sz="4"/>
-              <w:bottom w:val="single" w:color="BFBFBF" w:sz="4"/>
-              <w:right w:val="single" w:color="BFBFBF" w:sz="4"/>
-            </w:tcBorders>
-            <w:tcMar>
-              <w:top w:type="dxa" w:w="80"/>
-              <w:left w:type="dxa" w:w="120"/>
-              <w:bottom w:type="dxa" w:w="80"/>
-              <w:right w:type="dxa" w:w="120"/>
-            </w:tcMar>
-          </w:tcPr>
-          <w:p>
-            <w:r>
-              <w:rPr>
-                <w:rFonts w:ascii="Malgun Gothic" w:cs="Malgun Gothic" w:eastAsia="Malgun Gothic" w:hAnsi="Malgun Gothic"/>
-                <w:b/>
-                <w:bCs/>
-                <w:sz w:val="20"/>
-                <w:szCs w:val="20"/>
-              </w:rPr>
-              <w:t xml:space="preserve">계약 주체 / 입금 주체</w:t>
-            </w:r>
-          </w:p>
-        </w:tc>
-      </w:tr>
-      <w:tr>
-        <w:tc>
-          <w:tcPr>
-            <w:tcW w:type="dxa" w:w="3120"/>
-            <w:tcBorders>
-              <w:top w:val="single" w:color="BFBFBF" w:sz="4"/>
-              <w:left w:val="single" w:color="BFBFBF" w:sz="4"/>
-              <w:bottom w:val="single" w:color="BFBFBF" w:sz="4"/>
-              <w:right w:val="single" w:color="BFBFBF" w:sz="4"/>
-            </w:tcBorders>
-            <w:tcMar>
-              <w:top w:type="dxa" w:w="80"/>
-              <w:left w:type="dxa" w:w="120"/>
-              <w:bottom w:type="dxa" w:w="80"/>
-              <w:right w:type="dxa" w:w="120"/>
-            </w:tcMar>
-          </w:tcPr>
-          <w:p>
-            <w:r>
-              <w:rPr>
-                <w:rFonts w:ascii="Malgun Gothic" w:cs="Malgun Gothic" w:eastAsia="Malgun Gothic" w:hAnsi="Malgun Gothic"/>
-                <w:sz w:val="20"/>
-                <w:szCs w:val="20"/>
-              </w:rPr>
-              <w:t xml:space="preserve">지사 1</w:t>
-            </w:r>
-          </w:p>
-        </w:tc>
-        <w:tc>
-          <w:tcPr>
-            <w:tcW w:type="dxa" w:w="3120"/>
-            <w:tcBorders>
-              <w:top w:val="single" w:color="BFBFBF" w:sz="4"/>
-              <w:left w:val="single" w:color="BFBFBF" w:sz="4"/>
-              <w:bottom w:val="single" w:color="BFBFBF" w:sz="4"/>
-              <w:right w:val="single" w:color="BFBFBF" w:sz="4"/>
-            </w:tcBorders>
-            <w:tcMar>
-              <w:top w:type="dxa" w:w="80"/>
-              <w:left w:type="dxa" w:w="120"/>
-              <w:bottom w:type="dxa" w:w="80"/>
-              <w:right w:type="dxa" w:w="120"/>
-            </w:tcMar>
-          </w:tcPr>
-          <w:p>
-            <w:r>
-              <w:rPr>
-                <w:rFonts w:ascii="Malgun Gothic" w:cs="Malgun Gothic" w:eastAsia="Malgun Gothic" w:hAnsi="Malgun Gothic"/>
-                <w:sz w:val="20"/>
-                <w:szCs w:val="20"/>
-              </w:rPr>
-              <w:t xml:space="preserve">한국</w:t>
-            </w:r>
-          </w:p>
-        </w:tc>
-        <w:tc>
-          <w:tcPr>
-            <w:tcW w:type="dxa" w:w="3120"/>
-            <w:tcBorders>
-              <w:top w:val="single" w:color="BFBFBF" w:sz="4"/>
-              <w:left w:val="single" w:color="BFBFBF" w:sz="4"/>
-              <w:bottom w:val="single" w:color="BFBFBF" w:sz="4"/>
-              <w:right w:val="single" w:color="BFBFBF" w:sz="4"/>
-            </w:tcBorders>
-            <w:tcMar>
-              <w:top w:type="dxa" w:w="80"/>
-              <w:left w:type="dxa" w:w="120"/>
-              <w:bottom w:type="dxa" w:w="80"/>
-              <w:right w:type="dxa" w:w="120"/>
-            </w:tcMar>
-          </w:tcPr>
-          <w:p>
-            <w:r>
-              <w:rPr>
-                <w:rFonts w:ascii="Malgun Gothic" w:cs="Malgun Gothic" w:eastAsia="Malgun Gothic" w:hAnsi="Malgun Gothic"/>
-                <w:sz w:val="20"/>
-                <w:szCs w:val="20"/>
-              </w:rPr>
-              <w:t xml:space="preserve">한국 시장 운영</w:t>
-            </w:r>
-          </w:p>
-        </w:tc>
-      </w:tr>
-      <w:tr>
-        <w:tc>
-          <w:tcPr>
-            <w:tcW w:type="dxa" w:w="3120"/>
-            <w:tcBorders>
-              <w:top w:val="single" w:color="BFBFBF" w:sz="4"/>
-              <w:left w:val="single" w:color="BFBFBF" w:sz="4"/>
-              <w:bottom w:val="single" w:color="BFBFBF" w:sz="4"/>
-              <w:right w:val="single" w:color="BFBFBF" w:sz="4"/>
-            </w:tcBorders>
-            <w:tcMar>
-              <w:top w:type="dxa" w:w="80"/>
-              <w:left w:type="dxa" w:w="120"/>
-              <w:bottom w:type="dxa" w:w="80"/>
-              <w:right w:type="dxa" w:w="120"/>
-            </w:tcMar>
-          </w:tcPr>
-          <w:p>
-            <w:r>
-              <w:rPr>
-                <w:rFonts w:ascii="Malgun Gothic" w:cs="Malgun Gothic" w:eastAsia="Malgun Gothic" w:hAnsi="Malgun Gothic"/>
-                <w:sz w:val="20"/>
-                <w:szCs w:val="20"/>
-              </w:rPr>
-              <w:t xml:space="preserve">지사 2</w:t>
-            </w:r>
-          </w:p>
-        </w:tc>
-        <w:tc>
-          <w:tcPr>
-            <w:tcW w:type="dxa" w:w="3120"/>
-            <w:tcBorders>
-              <w:top w:val="single" w:color="BFBFBF" w:sz="4"/>
-              <w:left w:val="single" w:color="BFBFBF" w:sz="4"/>
-              <w:bottom w:val="single" w:color="BFBFBF" w:sz="4"/>
-              <w:right w:val="single" w:color="BFBFBF" w:sz="4"/>
-            </w:tcBorders>
-            <w:tcMar>
-              <w:top w:type="dxa" w:w="80"/>
-              <w:left w:type="dxa" w:w="120"/>
-              <w:bottom w:type="dxa" w:w="80"/>
-              <w:right w:type="dxa" w:w="120"/>
-            </w:tcMar>
-          </w:tcPr>
-          <w:p>
-            <w:r>
-              <w:rPr>
-                <w:rFonts w:ascii="Malgun Gothic" w:cs="Malgun Gothic" w:eastAsia="Malgun Gothic" w:hAnsi="Malgun Gothic"/>
-                <w:sz w:val="20"/>
-                <w:szCs w:val="20"/>
-              </w:rPr>
-              <w:t xml:space="preserve">일본</w:t>
-            </w:r>
-          </w:p>
-        </w:tc>
-        <w:tc>
-          <w:tcPr>
-            <w:tcW w:type="dxa" w:w="3120"/>
-            <w:tcBorders>
-              <w:top w:val="single" w:color="BFBFBF" w:sz="4"/>
-              <w:left w:val="single" w:color="BFBFBF" w:sz="4"/>
-              <w:bottom w:val="single" w:color="BFBFBF" w:sz="4"/>
-              <w:right w:val="single" w:color="BFBFBF" w:sz="4"/>
-            </w:tcBorders>
-            <w:tcMar>
-              <w:top w:type="dxa" w:w="80"/>
-              <w:left w:type="dxa" w:w="120"/>
-              <w:bottom w:type="dxa" w:w="80"/>
-              <w:right w:type="dxa" w:w="120"/>
-            </w:tcMar>
-          </w:tcPr>
-          <w:p>
-            <w:r>
-              <w:rPr>
-                <w:rFonts w:ascii="Malgun Gothic" w:cs="Malgun Gothic" w:eastAsia="Malgun Gothic" w:hAnsi="Malgun Gothic"/>
-                <w:sz w:val="20"/>
-                <w:szCs w:val="20"/>
-              </w:rPr>
-              <w:t xml:space="preserve">일본 시장 운영</w:t>
-            </w:r>
-          </w:p>
-        </w:tc>
-      </w:tr>
-      <w:tr>
-        <w:tc>
-          <w:tcPr>
-            <w:tcW w:type="dxa" w:w="3120"/>
-            <w:tcBorders>
-              <w:top w:val="single" w:color="BFBFBF" w:sz="4"/>
-              <w:left w:val="single" w:color="BFBFBF" w:sz="4"/>
-              <w:bottom w:val="single" w:color="BFBFBF" w:sz="4"/>
-              <w:right w:val="single" w:color="BFBFBF" w:sz="4"/>
-            </w:tcBorders>
-            <w:tcMar>
-              <w:top w:type="dxa" w:w="80"/>
-              <w:left w:type="dxa" w:w="120"/>
-              <w:bottom w:type="dxa" w:w="80"/>
-              <w:right w:type="dxa" w:w="120"/>
-            </w:tcMar>
-          </w:tcPr>
-          <w:p>
-            <w:r>
-              <w:rPr>
-                <w:rFonts w:ascii="Malgun Gothic" w:cs="Malgun Gothic" w:eastAsia="Malgun Gothic" w:hAnsi="Malgun Gothic"/>
-                <w:sz w:val="20"/>
-                <w:szCs w:val="20"/>
-              </w:rPr>
-              <w:t xml:space="preserve">지사 3</w:t>
-            </w:r>
-          </w:p>
-        </w:tc>
-        <w:tc>
-          <w:tcPr>
-            <w:tcW w:type="dxa" w:w="3120"/>
-            <w:tcBorders>
-              <w:top w:val="single" w:color="BFBFBF" w:sz="4"/>
-              <w:left w:val="single" w:color="BFBFBF" w:sz="4"/>
-              <w:bottom w:val="single" w:color="BFBFBF" w:sz="4"/>
-              <w:right w:val="single" w:color="BFBFBF" w:sz="4"/>
-            </w:tcBorders>
-            <w:tcMar>
-              <w:top w:type="dxa" w:w="80"/>
-              <w:left w:type="dxa" w:w="120"/>
-              <w:bottom w:type="dxa" w:w="80"/>
-              <w:right w:type="dxa" w:w="120"/>
-            </w:tcMar>
-          </w:tcPr>
-          <w:p>
-            <w:r>
-              <w:rPr>
-                <w:rFonts w:ascii="Malgun Gothic" w:cs="Malgun Gothic" w:eastAsia="Malgun Gothic" w:hAnsi="Malgun Gothic"/>
-                <w:sz w:val="20"/>
-                <w:szCs w:val="20"/>
-              </w:rPr>
-              <w:t xml:space="preserve">베트남</w:t>
-            </w:r>
-          </w:p>
-        </w:tc>
-        <w:tc>
-          <w:tcPr>
-            <w:tcW w:type="dxa" w:w="3120"/>
-            <w:tcBorders>
-              <w:top w:val="single" w:color="BFBFBF" w:sz="4"/>
-              <w:left w:val="single" w:color="BFBFBF" w:sz="4"/>
-              <w:bottom w:val="single" w:color="BFBFBF" w:sz="4"/>
-              <w:right w:val="single" w:color="BFBFBF" w:sz="4"/>
-            </w:tcBorders>
-            <w:tcMar>
-              <w:top w:type="dxa" w:w="80"/>
-              <w:left w:type="dxa" w:w="120"/>
-              <w:bottom w:type="dxa" w:w="80"/>
-              <w:right w:type="dxa" w:w="120"/>
-            </w:tcMar>
-          </w:tcPr>
-          <w:p>
-            <w:r>
-              <w:rPr>
-                <w:rFonts w:ascii="Malgun Gothic" w:cs="Malgun Gothic" w:eastAsia="Malgun Gothic" w:hAnsi="Malgun Gothic"/>
-                <w:sz w:val="20"/>
-                <w:szCs w:val="20"/>
-              </w:rPr>
-              <w:t xml:space="preserve">베트남 + 동남아 시장 운영</w:t>
-            </w:r>
-          </w:p>
-        </w:tc>
-      </w:tr>
-      <w:tr>
-        <w:tc>
-          <w:tcPr>
-            <w:tcW w:type="dxa" w:w="3120"/>
-            <w:tcBorders>
-              <w:top w:val="single" w:color="BFBFBF" w:sz="4"/>
-              <w:left w:val="single" w:color="BFBFBF" w:sz="4"/>
-              <w:bottom w:val="single" w:color="BFBFBF" w:sz="4"/>
-              <w:right w:val="single" w:color="BFBFBF" w:sz="4"/>
-            </w:tcBorders>
-            <w:tcMar>
-              <w:top w:type="dxa" w:w="80"/>
-              <w:left w:type="dxa" w:w="120"/>
-              <w:bottom w:type="dxa" w:w="80"/>
-              <w:right w:type="dxa" w:w="120"/>
-            </w:tcMar>
-          </w:tcPr>
-          <w:p>
-            <w:r>
-              <w:rPr>
-                <w:rFonts w:ascii="Malgun Gothic" w:cs="Malgun Gothic" w:eastAsia="Malgun Gothic" w:hAnsi="Malgun Gothic"/>
-                <w:sz w:val="20"/>
-                <w:szCs w:val="20"/>
-              </w:rPr>
-              <w:t xml:space="preserve">지사 4</w:t>
-            </w:r>
-          </w:p>
-        </w:tc>
-        <w:tc>
-          <w:tcPr>
-            <w:tcW w:type="dxa" w:w="3120"/>
-            <w:tcBorders>
-              <w:top w:val="single" w:color="BFBFBF" w:sz="4"/>
-              <w:left w:val="single" w:color="BFBFBF" w:sz="4"/>
-              <w:bottom w:val="single" w:color="BFBFBF" w:sz="4"/>
-              <w:right w:val="single" w:color="BFBFBF" w:sz="4"/>
-            </w:tcBorders>
-            <w:tcMar>
-              <w:top w:type="dxa" w:w="80"/>
-              <w:left w:type="dxa" w:w="120"/>
-              <w:bottom w:type="dxa" w:w="80"/>
-              <w:right w:type="dxa" w:w="120"/>
-            </w:tcMar>
-          </w:tcPr>
-          <w:p>
-            <w:r>
-              <w:rPr>
-                <w:rFonts w:ascii="Malgun Gothic" w:cs="Malgun Gothic" w:eastAsia="Malgun Gothic" w:hAnsi="Malgun Gothic"/>
-                <w:sz w:val="20"/>
-                <w:szCs w:val="20"/>
-              </w:rPr>
-              <w:t xml:space="preserve">홍콩 (오픈 예정)</w:t>
-            </w:r>
-          </w:p>
-        </w:tc>
-        <w:tc>
-          <w:tcPr>
-            <w:tcW w:type="dxa" w:w="3120"/>
-            <w:tcBorders>
-              <w:top w:val="single" w:color="BFBFBF" w:sz="4"/>
-              <w:left w:val="single" w:color="BFBFBF" w:sz="4"/>
-              <w:bottom w:val="single" w:color="BFBFBF" w:sz="4"/>
-              <w:right w:val="single" w:color="BFBFBF" w:sz="4"/>
-            </w:tcBorders>
-            <w:tcMar>
-              <w:top w:type="dxa" w:w="80"/>
-              <w:left w:type="dxa" w:w="120"/>
-              <w:bottom w:type="dxa" w:w="80"/>
-              <w:right w:type="dxa" w:w="120"/>
-            </w:tcMar>
-          </w:tcPr>
-          <w:p>
-            <w:r>
-              <w:rPr>
-                <w:rFonts w:ascii="Malgun Gothic" w:cs="Malgun Gothic" w:eastAsia="Malgun Gothic" w:hAnsi="Malgun Gothic"/>
-                <w:sz w:val="20"/>
-                <w:szCs w:val="20"/>
-              </w:rPr>
-              <w:t xml:space="preserve">대중화권 운영</w:t>
+              <w:t xml:space="preserve">채택</w:t>
             </w:r>
           </w:p>
         </w:tc>
@@ -688,6 +1068,59 @@
     <w:p>
       <w:r>
         <w:t xml:space="preserve"/>
+      </w:r>
+    </w:p>
+    <w:p>
+      <w:r>
+        <w:t xml:space="preserve"/>
+      </w:r>
+    </w:p>
+    <w:p>
+      <w:pPr>
+        <w:pBdr>
+          <w:bottom w:val="single" w:color="999999" w:sz="6" w:space="1"/>
+        </w:pBdr>
+        <w:spacing w:after="100" w:before="100"/>
+      </w:pPr>
+      <w:r>
+        <w:t xml:space="preserve"/>
+      </w:r>
+    </w:p>
+    <w:p>
+      <w:r>
+        <w:t xml:space="preserve"/>
+      </w:r>
+    </w:p>
+    <w:p>
+      <w:pPr>
+        <w:pBdr>
+          <w:bottom w:val="single" w:color="999999" w:sz="6" w:space="1"/>
+        </w:pBdr>
+        <w:spacing w:after="100" w:before="100"/>
+      </w:pPr>
+      <w:r>
+        <w:t xml:space="preserve"/>
+      </w:r>
+    </w:p>
+    <w:p>
+      <w:r>
+        <w:t xml:space="preserve"/>
+      </w:r>
+    </w:p>
+    <w:p>
+      <w:pPr>
+        <w:pStyle w:val="Heading2"/>
+        <w:spacing w:after="150" w:before="300"/>
+      </w:pPr>
+      <w:r>
+        <w:rPr>
+          <w:rFonts w:ascii="Malgun Gothic" w:cs="Malgun Gothic" w:eastAsia="Malgun Gothic" w:hAnsi="Malgun Gothic"/>
+          <w:b/>
+          <w:bCs/>
+          <w:sz w:val="30"/>
+          <w:szCs w:val="30"/>
+        </w:rPr>
+        <w:t xml:space="preserve">🏢 비즈니스 구조 (확정)</w:t>
       </w:r>
     </w:p>
     <w:p>
@@ -708,7 +1141,7 @@
           <w:sz w:val="26"/>
           <w:szCs w:val="26"/>
         </w:rPr>
-        <w:t xml:space="preserve">메인 세일즈 4개 권역</w:t>
+        <w:t xml:space="preserve">법인 구조</w:t>
       </w:r>
     </w:p>
     <w:p>
@@ -842,6 +1275,567 @@
                 <w:sz w:val="20"/>
                 <w:szCs w:val="20"/>
               </w:rPr>
+              <w:t xml:space="preserve">본사</w:t>
+            </w:r>
+          </w:p>
+        </w:tc>
+        <w:tc>
+          <w:tcPr>
+            <w:tcW w:type="dxa" w:w="3120"/>
+            <w:tcBorders>
+              <w:top w:val="single" w:color="BFBFBF" w:sz="4"/>
+              <w:left w:val="single" w:color="BFBFBF" w:sz="4"/>
+              <w:bottom w:val="single" w:color="BFBFBF" w:sz="4"/>
+              <w:right w:val="single" w:color="BFBFBF" w:sz="4"/>
+            </w:tcBorders>
+            <w:tcMar>
+              <w:top w:type="dxa" w:w="80"/>
+              <w:left w:type="dxa" w:w="120"/>
+              <w:bottom w:type="dxa" w:w="80"/>
+              <w:right w:type="dxa" w:w="120"/>
+            </w:tcMar>
+          </w:tcPr>
+          <w:p>
+            <w:r>
+              <w:rPr>
+                <w:rFonts w:ascii="Malgun Gothic" w:cs="Malgun Gothic" w:eastAsia="Malgun Gothic" w:hAnsi="Malgun Gothic"/>
+                <w:b/>
+                <w:bCs/>
+                <w:sz w:val="20"/>
+                <w:szCs w:val="20"/>
+              </w:rPr>
+              <w:t xml:space="preserve">싱가포르</w:t>
+            </w:r>
+            <w:r>
+              <w:rPr>
+                <w:rFonts w:ascii="Malgun Gothic" w:cs="Malgun Gothic" w:eastAsia="Malgun Gothic" w:hAnsi="Malgun Gothic"/>
+                <w:sz w:val="20"/>
+                <w:szCs w:val="20"/>
+              </w:rPr>
+              <w:t xml:space="preserve"> (omh-sg)</w:t>
+            </w:r>
+          </w:p>
+        </w:tc>
+        <w:tc>
+          <w:tcPr>
+            <w:tcW w:type="dxa" w:w="3120"/>
+            <w:tcBorders>
+              <w:top w:val="single" w:color="BFBFBF" w:sz="4"/>
+              <w:left w:val="single" w:color="BFBFBF" w:sz="4"/>
+              <w:bottom w:val="single" w:color="BFBFBF" w:sz="4"/>
+              <w:right w:val="single" w:color="BFBFBF" w:sz="4"/>
+            </w:tcBorders>
+            <w:tcMar>
+              <w:top w:type="dxa" w:w="80"/>
+              <w:left w:type="dxa" w:w="120"/>
+              <w:bottom w:type="dxa" w:w="80"/>
+              <w:right w:type="dxa" w:w="120"/>
+            </w:tcMar>
+          </w:tcPr>
+          <w:p>
+            <w:r>
+              <w:rPr>
+                <w:rFonts w:ascii="Malgun Gothic" w:cs="Malgun Gothic" w:eastAsia="Malgun Gothic" w:hAnsi="Malgun Gothic"/>
+                <w:b/>
+                <w:bCs/>
+                <w:sz w:val="20"/>
+                <w:szCs w:val="20"/>
+              </w:rPr>
+              <w:t xml:space="preserve">계약 주체 / 입금 주체</w:t>
+            </w:r>
+          </w:p>
+        </w:tc>
+      </w:tr>
+      <w:tr>
+        <w:tc>
+          <w:tcPr>
+            <w:tcW w:type="dxa" w:w="3120"/>
+            <w:tcBorders>
+              <w:top w:val="single" w:color="BFBFBF" w:sz="4"/>
+              <w:left w:val="single" w:color="BFBFBF" w:sz="4"/>
+              <w:bottom w:val="single" w:color="BFBFBF" w:sz="4"/>
+              <w:right w:val="single" w:color="BFBFBF" w:sz="4"/>
+            </w:tcBorders>
+            <w:tcMar>
+              <w:top w:type="dxa" w:w="80"/>
+              <w:left w:type="dxa" w:w="120"/>
+              <w:bottom w:type="dxa" w:w="80"/>
+              <w:right w:type="dxa" w:w="120"/>
+            </w:tcMar>
+          </w:tcPr>
+          <w:p>
+            <w:r>
+              <w:rPr>
+                <w:rFonts w:ascii="Malgun Gothic" w:cs="Malgun Gothic" w:eastAsia="Malgun Gothic" w:hAnsi="Malgun Gothic"/>
+                <w:sz w:val="20"/>
+                <w:szCs w:val="20"/>
+              </w:rPr>
+              <w:t xml:space="preserve">지사 1</w:t>
+            </w:r>
+          </w:p>
+        </w:tc>
+        <w:tc>
+          <w:tcPr>
+            <w:tcW w:type="dxa" w:w="3120"/>
+            <w:tcBorders>
+              <w:top w:val="single" w:color="BFBFBF" w:sz="4"/>
+              <w:left w:val="single" w:color="BFBFBF" w:sz="4"/>
+              <w:bottom w:val="single" w:color="BFBFBF" w:sz="4"/>
+              <w:right w:val="single" w:color="BFBFBF" w:sz="4"/>
+            </w:tcBorders>
+            <w:tcMar>
+              <w:top w:type="dxa" w:w="80"/>
+              <w:left w:type="dxa" w:w="120"/>
+              <w:bottom w:type="dxa" w:w="80"/>
+              <w:right w:type="dxa" w:w="120"/>
+            </w:tcMar>
+          </w:tcPr>
+          <w:p>
+            <w:r>
+              <w:rPr>
+                <w:rFonts w:ascii="Malgun Gothic" w:cs="Malgun Gothic" w:eastAsia="Malgun Gothic" w:hAnsi="Malgun Gothic"/>
+                <w:sz w:val="20"/>
+                <w:szCs w:val="20"/>
+              </w:rPr>
+              <w:t xml:space="preserve">한국</w:t>
+            </w:r>
+          </w:p>
+        </w:tc>
+        <w:tc>
+          <w:tcPr>
+            <w:tcW w:type="dxa" w:w="3120"/>
+            <w:tcBorders>
+              <w:top w:val="single" w:color="BFBFBF" w:sz="4"/>
+              <w:left w:val="single" w:color="BFBFBF" w:sz="4"/>
+              <w:bottom w:val="single" w:color="BFBFBF" w:sz="4"/>
+              <w:right w:val="single" w:color="BFBFBF" w:sz="4"/>
+            </w:tcBorders>
+            <w:tcMar>
+              <w:top w:type="dxa" w:w="80"/>
+              <w:left w:type="dxa" w:w="120"/>
+              <w:bottom w:type="dxa" w:w="80"/>
+              <w:right w:type="dxa" w:w="120"/>
+            </w:tcMar>
+          </w:tcPr>
+          <w:p>
+            <w:r>
+              <w:rPr>
+                <w:rFonts w:ascii="Malgun Gothic" w:cs="Malgun Gothic" w:eastAsia="Malgun Gothic" w:hAnsi="Malgun Gothic"/>
+                <w:sz w:val="20"/>
+                <w:szCs w:val="20"/>
+              </w:rPr>
+              <w:t xml:space="preserve">한국 시장 운영</w:t>
+            </w:r>
+          </w:p>
+        </w:tc>
+      </w:tr>
+      <w:tr>
+        <w:tc>
+          <w:tcPr>
+            <w:tcW w:type="dxa" w:w="3120"/>
+            <w:tcBorders>
+              <w:top w:val="single" w:color="BFBFBF" w:sz="4"/>
+              <w:left w:val="single" w:color="BFBFBF" w:sz="4"/>
+              <w:bottom w:val="single" w:color="BFBFBF" w:sz="4"/>
+              <w:right w:val="single" w:color="BFBFBF" w:sz="4"/>
+            </w:tcBorders>
+            <w:tcMar>
+              <w:top w:type="dxa" w:w="80"/>
+              <w:left w:type="dxa" w:w="120"/>
+              <w:bottom w:type="dxa" w:w="80"/>
+              <w:right w:type="dxa" w:w="120"/>
+            </w:tcMar>
+          </w:tcPr>
+          <w:p>
+            <w:r>
+              <w:rPr>
+                <w:rFonts w:ascii="Malgun Gothic" w:cs="Malgun Gothic" w:eastAsia="Malgun Gothic" w:hAnsi="Malgun Gothic"/>
+                <w:sz w:val="20"/>
+                <w:szCs w:val="20"/>
+              </w:rPr>
+              <w:t xml:space="preserve">지사 2</w:t>
+            </w:r>
+          </w:p>
+        </w:tc>
+        <w:tc>
+          <w:tcPr>
+            <w:tcW w:type="dxa" w:w="3120"/>
+            <w:tcBorders>
+              <w:top w:val="single" w:color="BFBFBF" w:sz="4"/>
+              <w:left w:val="single" w:color="BFBFBF" w:sz="4"/>
+              <w:bottom w:val="single" w:color="BFBFBF" w:sz="4"/>
+              <w:right w:val="single" w:color="BFBFBF" w:sz="4"/>
+            </w:tcBorders>
+            <w:tcMar>
+              <w:top w:type="dxa" w:w="80"/>
+              <w:left w:type="dxa" w:w="120"/>
+              <w:bottom w:type="dxa" w:w="80"/>
+              <w:right w:type="dxa" w:w="120"/>
+            </w:tcMar>
+          </w:tcPr>
+          <w:p>
+            <w:r>
+              <w:rPr>
+                <w:rFonts w:ascii="Malgun Gothic" w:cs="Malgun Gothic" w:eastAsia="Malgun Gothic" w:hAnsi="Malgun Gothic"/>
+                <w:sz w:val="20"/>
+                <w:szCs w:val="20"/>
+              </w:rPr>
+              <w:t xml:space="preserve">일본</w:t>
+            </w:r>
+          </w:p>
+        </w:tc>
+        <w:tc>
+          <w:tcPr>
+            <w:tcW w:type="dxa" w:w="3120"/>
+            <w:tcBorders>
+              <w:top w:val="single" w:color="BFBFBF" w:sz="4"/>
+              <w:left w:val="single" w:color="BFBFBF" w:sz="4"/>
+              <w:bottom w:val="single" w:color="BFBFBF" w:sz="4"/>
+              <w:right w:val="single" w:color="BFBFBF" w:sz="4"/>
+            </w:tcBorders>
+            <w:tcMar>
+              <w:top w:type="dxa" w:w="80"/>
+              <w:left w:type="dxa" w:w="120"/>
+              <w:bottom w:type="dxa" w:w="80"/>
+              <w:right w:type="dxa" w:w="120"/>
+            </w:tcMar>
+          </w:tcPr>
+          <w:p>
+            <w:r>
+              <w:rPr>
+                <w:rFonts w:ascii="Malgun Gothic" w:cs="Malgun Gothic" w:eastAsia="Malgun Gothic" w:hAnsi="Malgun Gothic"/>
+                <w:sz w:val="20"/>
+                <w:szCs w:val="20"/>
+              </w:rPr>
+              <w:t xml:space="preserve">일본 시장 운영</w:t>
+            </w:r>
+          </w:p>
+        </w:tc>
+      </w:tr>
+      <w:tr>
+        <w:tc>
+          <w:tcPr>
+            <w:tcW w:type="dxa" w:w="3120"/>
+            <w:tcBorders>
+              <w:top w:val="single" w:color="BFBFBF" w:sz="4"/>
+              <w:left w:val="single" w:color="BFBFBF" w:sz="4"/>
+              <w:bottom w:val="single" w:color="BFBFBF" w:sz="4"/>
+              <w:right w:val="single" w:color="BFBFBF" w:sz="4"/>
+            </w:tcBorders>
+            <w:tcMar>
+              <w:top w:type="dxa" w:w="80"/>
+              <w:left w:type="dxa" w:w="120"/>
+              <w:bottom w:type="dxa" w:w="80"/>
+              <w:right w:type="dxa" w:w="120"/>
+            </w:tcMar>
+          </w:tcPr>
+          <w:p>
+            <w:r>
+              <w:rPr>
+                <w:rFonts w:ascii="Malgun Gothic" w:cs="Malgun Gothic" w:eastAsia="Malgun Gothic" w:hAnsi="Malgun Gothic"/>
+                <w:sz w:val="20"/>
+                <w:szCs w:val="20"/>
+              </w:rPr>
+              <w:t xml:space="preserve">지사 3</w:t>
+            </w:r>
+          </w:p>
+        </w:tc>
+        <w:tc>
+          <w:tcPr>
+            <w:tcW w:type="dxa" w:w="3120"/>
+            <w:tcBorders>
+              <w:top w:val="single" w:color="BFBFBF" w:sz="4"/>
+              <w:left w:val="single" w:color="BFBFBF" w:sz="4"/>
+              <w:bottom w:val="single" w:color="BFBFBF" w:sz="4"/>
+              <w:right w:val="single" w:color="BFBFBF" w:sz="4"/>
+            </w:tcBorders>
+            <w:tcMar>
+              <w:top w:type="dxa" w:w="80"/>
+              <w:left w:type="dxa" w:w="120"/>
+              <w:bottom w:type="dxa" w:w="80"/>
+              <w:right w:type="dxa" w:w="120"/>
+            </w:tcMar>
+          </w:tcPr>
+          <w:p>
+            <w:r>
+              <w:rPr>
+                <w:rFonts w:ascii="Malgun Gothic" w:cs="Malgun Gothic" w:eastAsia="Malgun Gothic" w:hAnsi="Malgun Gothic"/>
+                <w:sz w:val="20"/>
+                <w:szCs w:val="20"/>
+              </w:rPr>
+              <w:t xml:space="preserve">베트남</w:t>
+            </w:r>
+          </w:p>
+        </w:tc>
+        <w:tc>
+          <w:tcPr>
+            <w:tcW w:type="dxa" w:w="3120"/>
+            <w:tcBorders>
+              <w:top w:val="single" w:color="BFBFBF" w:sz="4"/>
+              <w:left w:val="single" w:color="BFBFBF" w:sz="4"/>
+              <w:bottom w:val="single" w:color="BFBFBF" w:sz="4"/>
+              <w:right w:val="single" w:color="BFBFBF" w:sz="4"/>
+            </w:tcBorders>
+            <w:tcMar>
+              <w:top w:type="dxa" w:w="80"/>
+              <w:left w:type="dxa" w:w="120"/>
+              <w:bottom w:type="dxa" w:w="80"/>
+              <w:right w:type="dxa" w:w="120"/>
+            </w:tcMar>
+          </w:tcPr>
+          <w:p>
+            <w:r>
+              <w:rPr>
+                <w:rFonts w:ascii="Malgun Gothic" w:cs="Malgun Gothic" w:eastAsia="Malgun Gothic" w:hAnsi="Malgun Gothic"/>
+                <w:sz w:val="20"/>
+                <w:szCs w:val="20"/>
+              </w:rPr>
+              <w:t xml:space="preserve">베트남 + 동남아 시장 운영</w:t>
+            </w:r>
+          </w:p>
+        </w:tc>
+      </w:tr>
+      <w:tr>
+        <w:tc>
+          <w:tcPr>
+            <w:tcW w:type="dxa" w:w="3120"/>
+            <w:tcBorders>
+              <w:top w:val="single" w:color="BFBFBF" w:sz="4"/>
+              <w:left w:val="single" w:color="BFBFBF" w:sz="4"/>
+              <w:bottom w:val="single" w:color="BFBFBF" w:sz="4"/>
+              <w:right w:val="single" w:color="BFBFBF" w:sz="4"/>
+            </w:tcBorders>
+            <w:tcMar>
+              <w:top w:type="dxa" w:w="80"/>
+              <w:left w:type="dxa" w:w="120"/>
+              <w:bottom w:type="dxa" w:w="80"/>
+              <w:right w:type="dxa" w:w="120"/>
+            </w:tcMar>
+          </w:tcPr>
+          <w:p>
+            <w:r>
+              <w:rPr>
+                <w:rFonts w:ascii="Malgun Gothic" w:cs="Malgun Gothic" w:eastAsia="Malgun Gothic" w:hAnsi="Malgun Gothic"/>
+                <w:sz w:val="20"/>
+                <w:szCs w:val="20"/>
+              </w:rPr>
+              <w:t xml:space="preserve">지사 4</w:t>
+            </w:r>
+          </w:p>
+        </w:tc>
+        <w:tc>
+          <w:tcPr>
+            <w:tcW w:type="dxa" w:w="3120"/>
+            <w:tcBorders>
+              <w:top w:val="single" w:color="BFBFBF" w:sz="4"/>
+              <w:left w:val="single" w:color="BFBFBF" w:sz="4"/>
+              <w:bottom w:val="single" w:color="BFBFBF" w:sz="4"/>
+              <w:right w:val="single" w:color="BFBFBF" w:sz="4"/>
+            </w:tcBorders>
+            <w:tcMar>
+              <w:top w:type="dxa" w:w="80"/>
+              <w:left w:type="dxa" w:w="120"/>
+              <w:bottom w:type="dxa" w:w="80"/>
+              <w:right w:type="dxa" w:w="120"/>
+            </w:tcMar>
+          </w:tcPr>
+          <w:p>
+            <w:r>
+              <w:rPr>
+                <w:rFonts w:ascii="Malgun Gothic" w:cs="Malgun Gothic" w:eastAsia="Malgun Gothic" w:hAnsi="Malgun Gothic"/>
+                <w:sz w:val="20"/>
+                <w:szCs w:val="20"/>
+              </w:rPr>
+              <w:t xml:space="preserve">홍콩 (오픈 예정)</w:t>
+            </w:r>
+          </w:p>
+        </w:tc>
+        <w:tc>
+          <w:tcPr>
+            <w:tcW w:type="dxa" w:w="3120"/>
+            <w:tcBorders>
+              <w:top w:val="single" w:color="BFBFBF" w:sz="4"/>
+              <w:left w:val="single" w:color="BFBFBF" w:sz="4"/>
+              <w:bottom w:val="single" w:color="BFBFBF" w:sz="4"/>
+              <w:right w:val="single" w:color="BFBFBF" w:sz="4"/>
+            </w:tcBorders>
+            <w:tcMar>
+              <w:top w:type="dxa" w:w="80"/>
+              <w:left w:type="dxa" w:w="120"/>
+              <w:bottom w:type="dxa" w:w="80"/>
+              <w:right w:type="dxa" w:w="120"/>
+            </w:tcMar>
+          </w:tcPr>
+          <w:p>
+            <w:r>
+              <w:rPr>
+                <w:rFonts w:ascii="Malgun Gothic" w:cs="Malgun Gothic" w:eastAsia="Malgun Gothic" w:hAnsi="Malgun Gothic"/>
+                <w:sz w:val="20"/>
+                <w:szCs w:val="20"/>
+              </w:rPr>
+              <w:t xml:space="preserve">대중화권 운영</w:t>
+            </w:r>
+          </w:p>
+        </w:tc>
+      </w:tr>
+    </w:tbl>
+    <w:p>
+      <w:r>
+        <w:t xml:space="preserve"/>
+      </w:r>
+    </w:p>
+    <w:p>
+      <w:r>
+        <w:t xml:space="preserve"/>
+      </w:r>
+    </w:p>
+    <w:p>
+      <w:pPr>
+        <w:pStyle w:val="Heading3"/>
+        <w:spacing w:after="120" w:before="240"/>
+      </w:pPr>
+      <w:r>
+        <w:rPr>
+          <w:rFonts w:ascii="Malgun Gothic" w:cs="Malgun Gothic" w:eastAsia="Malgun Gothic" w:hAnsi="Malgun Gothic"/>
+          <w:b/>
+          <w:bCs/>
+          <w:sz w:val="26"/>
+          <w:szCs w:val="26"/>
+        </w:rPr>
+        <w:t xml:space="preserve">메인 세일즈 4개 권역</w:t>
+      </w:r>
+    </w:p>
+    <w:p>
+      <w:r>
+        <w:t xml:space="preserve"/>
+      </w:r>
+    </w:p>
+    <w:tbl>
+      <w:tblPr>
+        <w:tblW w:type="dxa" w:w="9360"/>
+        <w:tblBorders>
+          <w:top w:val="single" w:color="auto" w:sz="4"/>
+          <w:left w:val="single" w:color="auto" w:sz="4"/>
+          <w:bottom w:val="single" w:color="auto" w:sz="4"/>
+          <w:right w:val="single" w:color="auto" w:sz="4"/>
+          <w:insideH w:val="single" w:color="auto" w:sz="4"/>
+          <w:insideV w:val="single" w:color="auto" w:sz="4"/>
+        </w:tblBorders>
+      </w:tblPr>
+      <w:tblGrid>
+        <w:gridCol w:w="3120"/>
+        <w:gridCol w:w="3120"/>
+        <w:gridCol w:w="3120"/>
+      </w:tblGrid>
+      <w:tr>
+        <w:trPr>
+          <w:tblHeader/>
+        </w:trPr>
+        <w:tc>
+          <w:tcPr>
+            <w:tcW w:type="dxa" w:w="3120"/>
+            <w:tcBorders>
+              <w:top w:val="single" w:color="BFBFBF" w:sz="4"/>
+              <w:left w:val="single" w:color="BFBFBF" w:sz="4"/>
+              <w:bottom w:val="single" w:color="BFBFBF" w:sz="4"/>
+              <w:right w:val="single" w:color="BFBFBF" w:sz="4"/>
+            </w:tcBorders>
+            <w:shd w:fill="D5E8F0" w:val="clear"/>
+            <w:tcMar>
+              <w:top w:type="dxa" w:w="80"/>
+              <w:left w:type="dxa" w:w="120"/>
+              <w:bottom w:type="dxa" w:w="80"/>
+              <w:right w:type="dxa" w:w="120"/>
+            </w:tcMar>
+          </w:tcPr>
+          <w:p>
+            <w:r>
+              <w:rPr>
+                <w:b/>
+                <w:bCs/>
+              </w:rPr>
+            </w:r>
+          </w:p>
+        </w:tc>
+        <w:tc>
+          <w:tcPr>
+            <w:tcW w:type="dxa" w:w="3120"/>
+            <w:tcBorders>
+              <w:top w:val="single" w:color="BFBFBF" w:sz="4"/>
+              <w:left w:val="single" w:color="BFBFBF" w:sz="4"/>
+              <w:bottom w:val="single" w:color="BFBFBF" w:sz="4"/>
+              <w:right w:val="single" w:color="BFBFBF" w:sz="4"/>
+            </w:tcBorders>
+            <w:shd w:fill="D5E8F0" w:val="clear"/>
+            <w:tcMar>
+              <w:top w:type="dxa" w:w="80"/>
+              <w:left w:type="dxa" w:w="120"/>
+              <w:bottom w:type="dxa" w:w="80"/>
+              <w:right w:type="dxa" w:w="120"/>
+            </w:tcMar>
+          </w:tcPr>
+          <w:p>
+            <w:r>
+              <w:rPr>
+                <w:b/>
+                <w:bCs/>
+              </w:rPr>
+            </w:r>
+          </w:p>
+        </w:tc>
+        <w:tc>
+          <w:tcPr>
+            <w:tcW w:type="dxa" w:w="3120"/>
+            <w:tcBorders>
+              <w:top w:val="single" w:color="BFBFBF" w:sz="4"/>
+              <w:left w:val="single" w:color="BFBFBF" w:sz="4"/>
+              <w:bottom w:val="single" w:color="BFBFBF" w:sz="4"/>
+              <w:right w:val="single" w:color="BFBFBF" w:sz="4"/>
+            </w:tcBorders>
+            <w:shd w:fill="D5E8F0" w:val="clear"/>
+            <w:tcMar>
+              <w:top w:type="dxa" w:w="80"/>
+              <w:left w:type="dxa" w:w="120"/>
+              <w:bottom w:type="dxa" w:w="80"/>
+              <w:right w:type="dxa" w:w="120"/>
+            </w:tcMar>
+          </w:tcPr>
+          <w:p>
+            <w:r>
+              <w:rPr>
+                <w:b/>
+                <w:bCs/>
+              </w:rPr>
+            </w:r>
+          </w:p>
+        </w:tc>
+      </w:tr>
+      <w:tr>
+        <w:tc>
+          <w:tcPr>
+            <w:tcW w:type="dxa" w:w="3120"/>
+            <w:tcBorders>
+              <w:top w:val="single" w:color="BFBFBF" w:sz="4"/>
+              <w:left w:val="single" w:color="BFBFBF" w:sz="4"/>
+              <w:bottom w:val="single" w:color="BFBFBF" w:sz="4"/>
+              <w:right w:val="single" w:color="BFBFBF" w:sz="4"/>
+            </w:tcBorders>
+            <w:tcMar>
+              <w:top w:type="dxa" w:w="80"/>
+              <w:left w:type="dxa" w:w="120"/>
+              <w:bottom w:type="dxa" w:w="80"/>
+              <w:right w:type="dxa" w:w="120"/>
+            </w:tcMar>
+          </w:tcPr>
+          <w:p>
+            <w:r>
+              <w:rPr>
+                <w:rFonts w:ascii="Malgun Gothic" w:cs="Malgun Gothic" w:eastAsia="Malgun Gothic" w:hAnsi="Malgun Gothic"/>
+                <w:b/>
+                <w:bCs/>
+                <w:sz w:val="20"/>
+                <w:szCs w:val="20"/>
+              </w:rPr>
               <w:t xml:space="preserve">권역 1: 한국</w:t>
             </w:r>
           </w:p>
@@ -1242,7 +2236,7 @@
         <w:pStyle w:val="ListParagraph"/>
         <w:numPr>
           <w:ilvl w:val="0"/>
-          <w:numId w:val="2"/>
+          <w:numId w:val="3"/>
         </w:numPr>
         <w:spacing w:after="60"/>
       </w:pPr>
@@ -1280,7 +2274,7 @@
         <w:pStyle w:val="ListParagraph"/>
         <w:numPr>
           <w:ilvl w:val="0"/>
-          <w:numId w:val="2"/>
+          <w:numId w:val="3"/>
         </w:numPr>
         <w:spacing w:after="60"/>
       </w:pPr>
@@ -1318,7 +2312,7 @@
         <w:pStyle w:val="ListParagraph"/>
         <w:numPr>
           <w:ilvl w:val="0"/>
-          <w:numId w:val="2"/>
+          <w:numId w:val="3"/>
         </w:numPr>
         <w:spacing w:after="60"/>
       </w:pPr>
@@ -7948,7 +8942,7 @@
         <w:pStyle w:val="ListParagraph"/>
         <w:numPr>
           <w:ilvl w:val="0"/>
-          <w:numId w:val="3"/>
+          <w:numId w:val="2"/>
         </w:numPr>
         <w:spacing w:after="60"/>
       </w:pPr>
@@ -7976,7 +8970,7 @@
         <w:pStyle w:val="ListParagraph"/>
         <w:numPr>
           <w:ilvl w:val="0"/>
-          <w:numId w:val="3"/>
+          <w:numId w:val="2"/>
         </w:numPr>
         <w:spacing w:after="60"/>
       </w:pPr>
@@ -7994,7 +8988,7 @@
         <w:pStyle w:val="ListParagraph"/>
         <w:numPr>
           <w:ilvl w:val="0"/>
-          <w:numId w:val="3"/>
+          <w:numId w:val="2"/>
         </w:numPr>
         <w:spacing w:after="60"/>
       </w:pPr>
@@ -8033,7 +9027,7 @@
         <w:pStyle w:val="ListParagraph"/>
         <w:numPr>
           <w:ilvl w:val="0"/>
-          <w:numId w:val="3"/>
+          <w:numId w:val="2"/>
         </w:numPr>
         <w:spacing w:after="60"/>
       </w:pPr>
@@ -8051,7 +9045,7 @@
         <w:pStyle w:val="ListParagraph"/>
         <w:numPr>
           <w:ilvl w:val="0"/>
-          <w:numId w:val="3"/>
+          <w:numId w:val="2"/>
         </w:numPr>
         <w:spacing w:after="60"/>
       </w:pPr>
@@ -8069,7 +9063,7 @@
         <w:pStyle w:val="ListParagraph"/>
         <w:numPr>
           <w:ilvl w:val="0"/>
-          <w:numId w:val="3"/>
+          <w:numId w:val="2"/>
         </w:numPr>
         <w:spacing w:after="60"/>
       </w:pPr>
@@ -8794,7 +9788,7 @@
         <w:pStyle w:val="ListParagraph"/>
         <w:numPr>
           <w:ilvl w:val="0"/>
-          <w:numId w:val="3"/>
+          <w:numId w:val="2"/>
         </w:numPr>
         <w:spacing w:after="60"/>
       </w:pPr>
@@ -8812,7 +9806,7 @@
         <w:pStyle w:val="ListParagraph"/>
         <w:numPr>
           <w:ilvl w:val="0"/>
-          <w:numId w:val="3"/>
+          <w:numId w:val="2"/>
         </w:numPr>
         <w:spacing w:after="60"/>
       </w:pPr>
@@ -8830,7 +9824,7 @@
         <w:pStyle w:val="ListParagraph"/>
         <w:numPr>
           <w:ilvl w:val="0"/>
-          <w:numId w:val="3"/>
+          <w:numId w:val="2"/>
         </w:numPr>
         <w:spacing w:after="60"/>
       </w:pPr>
@@ -8869,7 +9863,7 @@
         <w:pStyle w:val="ListParagraph"/>
         <w:numPr>
           <w:ilvl w:val="0"/>
-          <w:numId w:val="3"/>
+          <w:numId w:val="2"/>
         </w:numPr>
         <w:spacing w:after="60"/>
       </w:pPr>
@@ -8905,7 +9899,7 @@
         <w:pStyle w:val="ListParagraph"/>
         <w:numPr>
           <w:ilvl w:val="0"/>
-          <w:numId w:val="3"/>
+          <w:numId w:val="2"/>
         </w:numPr>
         <w:spacing w:after="60"/>
       </w:pPr>
@@ -8941,7 +9935,7 @@
         <w:pStyle w:val="ListParagraph"/>
         <w:numPr>
           <w:ilvl w:val="0"/>
-          <w:numId w:val="3"/>
+          <w:numId w:val="2"/>
         </w:numPr>
         <w:spacing w:after="60"/>
       </w:pPr>
@@ -8998,7 +9992,7 @@
         <w:pStyle w:val="ListParagraph"/>
         <w:numPr>
           <w:ilvl w:val="0"/>
-          <w:numId w:val="3"/>
+          <w:numId w:val="2"/>
         </w:numPr>
         <w:spacing w:after="60"/>
       </w:pPr>
@@ -9034,7 +10028,7 @@
         <w:pStyle w:val="ListParagraph"/>
         <w:numPr>
           <w:ilvl w:val="0"/>
-          <w:numId w:val="3"/>
+          <w:numId w:val="2"/>
         </w:numPr>
         <w:spacing w:after="60"/>
       </w:pPr>
@@ -9070,7 +10064,7 @@
         <w:pStyle w:val="ListParagraph"/>
         <w:numPr>
           <w:ilvl w:val="0"/>
-          <w:numId w:val="3"/>
+          <w:numId w:val="2"/>
         </w:numPr>
         <w:spacing w:after="60"/>
       </w:pPr>
@@ -9106,7 +10100,7 @@
         <w:pStyle w:val="ListParagraph"/>
         <w:numPr>
           <w:ilvl w:val="0"/>
-          <w:numId w:val="3"/>
+          <w:numId w:val="2"/>
         </w:numPr>
         <w:spacing w:after="60"/>
       </w:pPr>
@@ -9163,7 +10157,7 @@
         <w:pStyle w:val="ListParagraph"/>
         <w:numPr>
           <w:ilvl w:val="0"/>
-          <w:numId w:val="3"/>
+          <w:numId w:val="2"/>
         </w:numPr>
         <w:spacing w:after="60"/>
       </w:pPr>
@@ -9199,7 +10193,7 @@
         <w:pStyle w:val="ListParagraph"/>
         <w:numPr>
           <w:ilvl w:val="0"/>
-          <w:numId w:val="3"/>
+          <w:numId w:val="2"/>
         </w:numPr>
         <w:spacing w:after="60"/>
       </w:pPr>
@@ -9235,7 +10229,7 @@
         <w:pStyle w:val="ListParagraph"/>
         <w:numPr>
           <w:ilvl w:val="0"/>
-          <w:numId w:val="3"/>
+          <w:numId w:val="2"/>
         </w:numPr>
         <w:spacing w:after="60"/>
       </w:pPr>
@@ -9271,7 +10265,7 @@
         <w:pStyle w:val="ListParagraph"/>
         <w:numPr>
           <w:ilvl w:val="0"/>
-          <w:numId w:val="3"/>
+          <w:numId w:val="2"/>
         </w:numPr>
         <w:spacing w:after="60"/>
       </w:pPr>
@@ -9328,7 +10322,7 @@
         <w:pStyle w:val="ListParagraph"/>
         <w:numPr>
           <w:ilvl w:val="0"/>
-          <w:numId w:val="3"/>
+          <w:numId w:val="2"/>
         </w:numPr>
         <w:spacing w:after="60"/>
       </w:pPr>
@@ -9364,7 +10358,7 @@
         <w:pStyle w:val="ListParagraph"/>
         <w:numPr>
           <w:ilvl w:val="0"/>
-          <w:numId w:val="3"/>
+          <w:numId w:val="2"/>
         </w:numPr>
         <w:spacing w:after="60"/>
       </w:pPr>
@@ -9400,7 +10394,7 @@
         <w:pStyle w:val="ListParagraph"/>
         <w:numPr>
           <w:ilvl w:val="0"/>
-          <w:numId w:val="3"/>
+          <w:numId w:val="2"/>
         </w:numPr>
         <w:spacing w:after="60"/>
       </w:pPr>
@@ -9465,7 +10459,7 @@
           <w:sz w:val="30"/>
           <w:szCs w:val="30"/>
         </w:rPr>
-        <w:t xml:space="preserve">🎯 마진 시뮬레이션 (Model C 적용)</w:t>
+        <w:t xml:space="preserve">🎯 마진 시뮬레이션 (Option C — PG 100% 고객 부담 적용)</w:t>
       </w:r>
     </w:p>
     <w:p>
@@ -9494,7 +10488,7 @@
         <w:pStyle w:val="ListParagraph"/>
         <w:numPr>
           <w:ilvl w:val="0"/>
-          <w:numId w:val="3"/>
+          <w:numId w:val="2"/>
         </w:numPr>
         <w:spacing w:after="60"/>
       </w:pPr>
@@ -9512,7 +10506,7 @@
         <w:pStyle w:val="ListParagraph"/>
         <w:numPr>
           <w:ilvl w:val="0"/>
-          <w:numId w:val="3"/>
+          <w:numId w:val="2"/>
         </w:numPr>
         <w:spacing w:after="60"/>
       </w:pPr>
@@ -9530,7 +10524,7 @@
         <w:pStyle w:val="ListParagraph"/>
         <w:numPr>
           <w:ilvl w:val="0"/>
-          <w:numId w:val="3"/>
+          <w:numId w:val="2"/>
         </w:numPr>
         <w:spacing w:after="60"/>
       </w:pPr>
@@ -9548,35 +10542,19 @@
         <w:pStyle w:val="ListParagraph"/>
         <w:numPr>
           <w:ilvl w:val="0"/>
-          <w:numId w:val="3"/>
+          <w:numId w:val="2"/>
         </w:numPr>
         <w:spacing w:after="60"/>
       </w:pPr>
       <w:r>
         <w:rPr>
           <w:rFonts w:ascii="Malgun Gothic" w:cs="Malgun Gothic" w:eastAsia="Malgun Gothic" w:hAnsi="Malgun Gothic"/>
-          <w:sz w:val="20"/>
-          <w:szCs w:val="20"/>
-        </w:rPr>
-        <w:t xml:space="preserve">평균 결제 수수료 (Model C): </w:t>
-      </w:r>
-      <w:r>
-        <w:rPr>
-          <w:rFonts w:ascii="Malgun Gothic" w:cs="Malgun Gothic" w:eastAsia="Malgun Gothic" w:hAnsi="Malgun Gothic"/>
           <w:b/>
           <w:bCs/>
           <w:sz w:val="20"/>
           <w:szCs w:val="20"/>
         </w:rPr>
-        <w:t xml:space="preserve">1.0%</w:t>
-      </w:r>
-      <w:r>
-        <w:rPr>
-          <w:rFonts w:ascii="Malgun Gothic" w:cs="Malgun Gothic" w:eastAsia="Malgun Gothic" w:hAnsi="Malgun Gothic"/>
-          <w:sz w:val="20"/>
-          <w:szCs w:val="20"/>
-        </w:rPr>
-        <w:t xml:space="preserve"> (가상계좌+Local PG 가중)</w:t>
+        <w:t xml:space="preserve">PG 수수료: 0% (DOTBIZ 부담 없음, 고객이 별도 결제)</w:t>
       </w:r>
     </w:p>
     <w:p>
@@ -9598,9 +10576,9 @@
         <w:t xml:space="preserve">Gross Margin:        4.00%
 − ELS:              -0.60%
 − CMS:              -1.00%
-− 결제 수수료:        -1.00%
+− PG 수수료:           0.00%  ← 고객 100% 부담
 ─────────────────────────────
-Net Margin:         +1.40% ✅</w:t>
+Net Margin:         +2.40% ✅✅</w:t>
       </w:r>
     </w:p>
     <w:p>
@@ -9628,7 +10606,15 @@
           <w:sz w:val="20"/>
           <w:szCs w:val="20"/>
         </w:rPr>
-        <w:t xml:space="preserve">마진 4% 환경에서도 Model C 적용 시 Net +1.4% 확보</w:t>
+        <w:t xml:space="preserve">PG 수수료 고객 부담 시 모든 권역에서 Net +2.4% 확보</w:t>
+      </w:r>
+      <w:r>
+        <w:rPr>
+          <w:rFonts w:ascii="Malgun Gothic" w:cs="Malgun Gothic" w:eastAsia="Malgun Gothic" w:hAnsi="Malgun Gothic"/>
+          <w:sz w:val="20"/>
+          <w:szCs w:val="20"/>
+        </w:rPr>
+        <w:t xml:space="preserve"> (마진 4% 환경)</w:t>
       </w:r>
     </w:p>
     <w:p>
@@ -9649,7 +10635,7 @@
           <w:sz w:val="26"/>
           <w:szCs w:val="26"/>
         </w:rPr>
-        <w:t xml:space="preserve">권역별 Net Margin (실측)</w:t>
+        <w:t xml:space="preserve">고객 입장 — 권역별 추가 부담</w:t>
       </w:r>
     </w:p>
     <w:p>
@@ -9781,34 +10767,34 @@
                 <w:sz w:val="20"/>
                 <w:szCs w:val="20"/>
               </w:rPr>
-              <w:t xml:space="preserve">한국 (가상계좌)</w:t>
-            </w:r>
-          </w:p>
-        </w:tc>
-        <w:tc>
-          <w:tcPr>
-            <w:tcW w:type="dxa" w:w="3120"/>
-            <w:tcBorders>
-              <w:top w:val="single" w:color="BFBFBF" w:sz="4"/>
-              <w:left w:val="single" w:color="BFBFBF" w:sz="4"/>
-              <w:bottom w:val="single" w:color="BFBFBF" w:sz="4"/>
-              <w:right w:val="single" w:color="BFBFBF" w:sz="4"/>
-            </w:tcBorders>
-            <w:tcMar>
-              <w:top w:type="dxa" w:w="80"/>
-              <w:left w:type="dxa" w:w="120"/>
-              <w:bottom w:type="dxa" w:w="80"/>
-              <w:right w:type="dxa" w:w="120"/>
-            </w:tcMar>
-          </w:tcPr>
-          <w:p>
-            <w:r>
-              <w:rPr>
-                <w:rFonts w:ascii="Malgun Gothic" w:cs="Malgun Gothic" w:eastAsia="Malgun Gothic" w:hAnsi="Malgun Gothic"/>
-                <w:sz w:val="20"/>
-                <w:szCs w:val="20"/>
-              </w:rPr>
-              <w:t xml:space="preserve">0.025%</w:t>
+              <w:t xml:space="preserve">한국</w:t>
+            </w:r>
+          </w:p>
+        </w:tc>
+        <w:tc>
+          <w:tcPr>
+            <w:tcW w:type="dxa" w:w="3120"/>
+            <w:tcBorders>
+              <w:top w:val="single" w:color="BFBFBF" w:sz="4"/>
+              <w:left w:val="single" w:color="BFBFBF" w:sz="4"/>
+              <w:bottom w:val="single" w:color="BFBFBF" w:sz="4"/>
+              <w:right w:val="single" w:color="BFBFBF" w:sz="4"/>
+            </w:tcBorders>
+            <w:tcMar>
+              <w:top w:type="dxa" w:w="80"/>
+              <w:left w:type="dxa" w:w="120"/>
+              <w:bottom w:type="dxa" w:w="80"/>
+              <w:right w:type="dxa" w:w="120"/>
+            </w:tcMar>
+          </w:tcPr>
+          <w:p>
+            <w:r>
+              <w:rPr>
+                <w:rFonts w:ascii="Malgun Gothic" w:cs="Malgun Gothic" w:eastAsia="Malgun Gothic" w:hAnsi="Malgun Gothic"/>
+                <w:sz w:val="20"/>
+                <w:szCs w:val="20"/>
+              </w:rPr>
+              <w:t xml:space="preserve">가상계좌</w:t>
             </w:r>
           </w:p>
         </w:tc>
@@ -9837,7 +10823,7 @@
                 <w:sz w:val="20"/>
                 <w:szCs w:val="20"/>
               </w:rPr>
-              <w:t xml:space="preserve">+2.4%</w:t>
+              <w:t xml:space="preserve">건당 250원 (0.025%)</w:t>
             </w:r>
           </w:p>
         </w:tc>
@@ -9866,61 +10852,61 @@
                 <w:sz w:val="20"/>
                 <w:szCs w:val="20"/>
               </w:rPr>
-              <w:t xml:space="preserve">대중화권 (Alipay 등)</w:t>
-            </w:r>
-          </w:p>
-        </w:tc>
-        <w:tc>
-          <w:tcPr>
-            <w:tcW w:type="dxa" w:w="3120"/>
-            <w:tcBorders>
-              <w:top w:val="single" w:color="BFBFBF" w:sz="4"/>
-              <w:left w:val="single" w:color="BFBFBF" w:sz="4"/>
-              <w:bottom w:val="single" w:color="BFBFBF" w:sz="4"/>
-              <w:right w:val="single" w:color="BFBFBF" w:sz="4"/>
-            </w:tcBorders>
-            <w:tcMar>
-              <w:top w:type="dxa" w:w="80"/>
-              <w:left w:type="dxa" w:w="120"/>
-              <w:bottom w:type="dxa" w:w="80"/>
-              <w:right w:type="dxa" w:w="120"/>
-            </w:tcMar>
-          </w:tcPr>
-          <w:p>
-            <w:r>
-              <w:rPr>
-                <w:rFonts w:ascii="Malgun Gothic" w:cs="Malgun Gothic" w:eastAsia="Malgun Gothic" w:hAnsi="Malgun Gothic"/>
-                <w:sz w:val="20"/>
-                <w:szCs w:val="20"/>
-              </w:rPr>
-              <w:t xml:space="preserve">1.0%</w:t>
-            </w:r>
-          </w:p>
-        </w:tc>
-        <w:tc>
-          <w:tcPr>
-            <w:tcW w:type="dxa" w:w="3120"/>
-            <w:tcBorders>
-              <w:top w:val="single" w:color="BFBFBF" w:sz="4"/>
-              <w:left w:val="single" w:color="BFBFBF" w:sz="4"/>
-              <w:bottom w:val="single" w:color="BFBFBF" w:sz="4"/>
-              <w:right w:val="single" w:color="BFBFBF" w:sz="4"/>
-            </w:tcBorders>
-            <w:tcMar>
-              <w:top w:type="dxa" w:w="80"/>
-              <w:left w:type="dxa" w:w="120"/>
-              <w:bottom w:type="dxa" w:w="80"/>
-              <w:right w:type="dxa" w:w="120"/>
-            </w:tcMar>
-          </w:tcPr>
-          <w:p>
-            <w:r>
-              <w:rPr>
-                <w:rFonts w:ascii="Malgun Gothic" w:cs="Malgun Gothic" w:eastAsia="Malgun Gothic" w:hAnsi="Malgun Gothic"/>
-                <w:sz w:val="20"/>
-                <w:szCs w:val="20"/>
-              </w:rPr>
-              <w:t xml:space="preserve">+1.4%</w:t>
+              <w:t xml:space="preserve">한국</w:t>
+            </w:r>
+          </w:p>
+        </w:tc>
+        <w:tc>
+          <w:tcPr>
+            <w:tcW w:type="dxa" w:w="3120"/>
+            <w:tcBorders>
+              <w:top w:val="single" w:color="BFBFBF" w:sz="4"/>
+              <w:left w:val="single" w:color="BFBFBF" w:sz="4"/>
+              <w:bottom w:val="single" w:color="BFBFBF" w:sz="4"/>
+              <w:right w:val="single" w:color="BFBFBF" w:sz="4"/>
+            </w:tcBorders>
+            <w:tcMar>
+              <w:top w:type="dxa" w:w="80"/>
+              <w:left w:type="dxa" w:w="120"/>
+              <w:bottom w:type="dxa" w:w="80"/>
+              <w:right w:type="dxa" w:w="120"/>
+            </w:tcMar>
+          </w:tcPr>
+          <w:p>
+            <w:r>
+              <w:rPr>
+                <w:rFonts w:ascii="Malgun Gothic" w:cs="Malgun Gothic" w:eastAsia="Malgun Gothic" w:hAnsi="Malgun Gothic"/>
+                <w:sz w:val="20"/>
+                <w:szCs w:val="20"/>
+              </w:rPr>
+              <w:t xml:space="preserve">카드</w:t>
+            </w:r>
+          </w:p>
+        </w:tc>
+        <w:tc>
+          <w:tcPr>
+            <w:tcW w:type="dxa" w:w="3120"/>
+            <w:tcBorders>
+              <w:top w:val="single" w:color="BFBFBF" w:sz="4"/>
+              <w:left w:val="single" w:color="BFBFBF" w:sz="4"/>
+              <w:bottom w:val="single" w:color="BFBFBF" w:sz="4"/>
+              <w:right w:val="single" w:color="BFBFBF" w:sz="4"/>
+            </w:tcBorders>
+            <w:tcMar>
+              <w:top w:type="dxa" w:w="80"/>
+              <w:left w:type="dxa" w:w="120"/>
+              <w:bottom w:type="dxa" w:w="80"/>
+              <w:right w:type="dxa" w:w="120"/>
+            </w:tcMar>
+          </w:tcPr>
+          <w:p>
+            <w:r>
+              <w:rPr>
+                <w:rFonts w:ascii="Malgun Gothic" w:cs="Malgun Gothic" w:eastAsia="Malgun Gothic" w:hAnsi="Malgun Gothic"/>
+                <w:sz w:val="20"/>
+                <w:szCs w:val="20"/>
+              </w:rPr>
+              <w:t xml:space="preserve">2.1~3.3%</w:t>
             </w:r>
           </w:p>
         </w:tc>
@@ -9949,61 +10935,61 @@
                 <w:sz w:val="20"/>
                 <w:szCs w:val="20"/>
               </w:rPr>
-              <w:t xml:space="preserve">베트남+동남아 (QR)</w:t>
-            </w:r>
-          </w:p>
-        </w:tc>
-        <w:tc>
-          <w:tcPr>
-            <w:tcW w:type="dxa" w:w="3120"/>
-            <w:tcBorders>
-              <w:top w:val="single" w:color="BFBFBF" w:sz="4"/>
-              <w:left w:val="single" w:color="BFBFBF" w:sz="4"/>
-              <w:bottom w:val="single" w:color="BFBFBF" w:sz="4"/>
-              <w:right w:val="single" w:color="BFBFBF" w:sz="4"/>
-            </w:tcBorders>
-            <w:tcMar>
-              <w:top w:type="dxa" w:w="80"/>
-              <w:left w:type="dxa" w:w="120"/>
-              <w:bottom w:type="dxa" w:w="80"/>
-              <w:right w:type="dxa" w:w="120"/>
-            </w:tcMar>
-          </w:tcPr>
-          <w:p>
-            <w:r>
-              <w:rPr>
-                <w:rFonts w:ascii="Malgun Gothic" w:cs="Malgun Gothic" w:eastAsia="Malgun Gothic" w:hAnsi="Malgun Gothic"/>
-                <w:sz w:val="20"/>
-                <w:szCs w:val="20"/>
-              </w:rPr>
-              <w:t xml:space="preserve">1.5%</w:t>
-            </w:r>
-          </w:p>
-        </w:tc>
-        <w:tc>
-          <w:tcPr>
-            <w:tcW w:type="dxa" w:w="3120"/>
-            <w:tcBorders>
-              <w:top w:val="single" w:color="BFBFBF" w:sz="4"/>
-              <w:left w:val="single" w:color="BFBFBF" w:sz="4"/>
-              <w:bottom w:val="single" w:color="BFBFBF" w:sz="4"/>
-              <w:right w:val="single" w:color="BFBFBF" w:sz="4"/>
-            </w:tcBorders>
-            <w:tcMar>
-              <w:top w:type="dxa" w:w="80"/>
-              <w:left w:type="dxa" w:w="120"/>
-              <w:bottom w:type="dxa" w:w="80"/>
-              <w:right w:type="dxa" w:w="120"/>
-            </w:tcMar>
-          </w:tcPr>
-          <w:p>
-            <w:r>
-              <w:rPr>
-                <w:rFonts w:ascii="Malgun Gothic" w:cs="Malgun Gothic" w:eastAsia="Malgun Gothic" w:hAnsi="Malgun Gothic"/>
-                <w:sz w:val="20"/>
-                <w:szCs w:val="20"/>
-              </w:rPr>
-              <w:t xml:space="preserve">+0.9% 🟡</w:t>
+              <w:t xml:space="preserve">한국</w:t>
+            </w:r>
+          </w:p>
+        </w:tc>
+        <w:tc>
+          <w:tcPr>
+            <w:tcW w:type="dxa" w:w="3120"/>
+            <w:tcBorders>
+              <w:top w:val="single" w:color="BFBFBF" w:sz="4"/>
+              <w:left w:val="single" w:color="BFBFBF" w:sz="4"/>
+              <w:bottom w:val="single" w:color="BFBFBF" w:sz="4"/>
+              <w:right w:val="single" w:color="BFBFBF" w:sz="4"/>
+            </w:tcBorders>
+            <w:tcMar>
+              <w:top w:type="dxa" w:w="80"/>
+              <w:left w:type="dxa" w:w="120"/>
+              <w:bottom w:type="dxa" w:w="80"/>
+              <w:right w:type="dxa" w:w="120"/>
+            </w:tcMar>
+          </w:tcPr>
+          <w:p>
+            <w:r>
+              <w:rPr>
+                <w:rFonts w:ascii="Malgun Gothic" w:cs="Malgun Gothic" w:eastAsia="Malgun Gothic" w:hAnsi="Malgun Gothic"/>
+                <w:sz w:val="20"/>
+                <w:szCs w:val="20"/>
+              </w:rPr>
+              <w:t xml:space="preserve">무통장 송금</w:t>
+            </w:r>
+          </w:p>
+        </w:tc>
+        <w:tc>
+          <w:tcPr>
+            <w:tcW w:type="dxa" w:w="3120"/>
+            <w:tcBorders>
+              <w:top w:val="single" w:color="BFBFBF" w:sz="4"/>
+              <w:left w:val="single" w:color="BFBFBF" w:sz="4"/>
+              <w:bottom w:val="single" w:color="BFBFBF" w:sz="4"/>
+              <w:right w:val="single" w:color="BFBFBF" w:sz="4"/>
+            </w:tcBorders>
+            <w:tcMar>
+              <w:top w:type="dxa" w:w="80"/>
+              <w:left w:type="dxa" w:w="120"/>
+              <w:bottom w:type="dxa" w:w="80"/>
+              <w:right w:type="dxa" w:w="120"/>
+            </w:tcMar>
+          </w:tcPr>
+          <w:p>
+            <w:r>
+              <w:rPr>
+                <w:rFonts w:ascii="Malgun Gothic" w:cs="Malgun Gothic" w:eastAsia="Malgun Gothic" w:hAnsi="Malgun Gothic"/>
+                <w:sz w:val="20"/>
+                <w:szCs w:val="20"/>
+              </w:rPr>
+              <w:t xml:space="preserve">0%</w:t>
             </w:r>
           </w:p>
         </w:tc>
@@ -10032,7 +11018,117 @@
                 <w:sz w:val="20"/>
                 <w:szCs w:val="20"/>
               </w:rPr>
-              <w:t xml:space="preserve">SG+MY (PayNow)</w:t>
+              <w:t xml:space="preserve">대중화권</w:t>
+            </w:r>
+          </w:p>
+        </w:tc>
+        <w:tc>
+          <w:tcPr>
+            <w:tcW w:type="dxa" w:w="3120"/>
+            <w:tcBorders>
+              <w:top w:val="single" w:color="BFBFBF" w:sz="4"/>
+              <w:left w:val="single" w:color="BFBFBF" w:sz="4"/>
+              <w:bottom w:val="single" w:color="BFBFBF" w:sz="4"/>
+              <w:right w:val="single" w:color="BFBFBF" w:sz="4"/>
+            </w:tcBorders>
+            <w:tcMar>
+              <w:top w:type="dxa" w:w="80"/>
+              <w:left w:type="dxa" w:w="120"/>
+              <w:bottom w:type="dxa" w:w="80"/>
+              <w:right w:type="dxa" w:w="120"/>
+            </w:tcMar>
+          </w:tcPr>
+          <w:p>
+            <w:r>
+              <w:rPr>
+                <w:rFonts w:ascii="Malgun Gothic" w:cs="Malgun Gothic" w:eastAsia="Malgun Gothic" w:hAnsi="Malgun Gothic"/>
+                <w:sz w:val="20"/>
+                <w:szCs w:val="20"/>
+              </w:rPr>
+              <w:t xml:space="preserve">Alipay/WeChat</w:t>
+            </w:r>
+          </w:p>
+        </w:tc>
+        <w:tc>
+          <w:tcPr>
+            <w:tcW w:type="dxa" w:w="3120"/>
+            <w:tcBorders>
+              <w:top w:val="single" w:color="BFBFBF" w:sz="4"/>
+              <w:left w:val="single" w:color="BFBFBF" w:sz="4"/>
+              <w:bottom w:val="single" w:color="BFBFBF" w:sz="4"/>
+              <w:right w:val="single" w:color="BFBFBF" w:sz="4"/>
+            </w:tcBorders>
+            <w:tcMar>
+              <w:top w:type="dxa" w:w="80"/>
+              <w:left w:type="dxa" w:w="120"/>
+              <w:bottom w:type="dxa" w:w="80"/>
+              <w:right w:type="dxa" w:w="120"/>
+            </w:tcMar>
+          </w:tcPr>
+          <w:p>
+            <w:r>
+              <w:rPr>
+                <w:rFonts w:ascii="Malgun Gothic" w:cs="Malgun Gothic" w:eastAsia="Malgun Gothic" w:hAnsi="Malgun Gothic"/>
+                <w:sz w:val="20"/>
+                <w:szCs w:val="20"/>
+              </w:rPr>
+              <w:t xml:space="preserve">1~2%</w:t>
+            </w:r>
+          </w:p>
+        </w:tc>
+      </w:tr>
+      <w:tr>
+        <w:tc>
+          <w:tcPr>
+            <w:tcW w:type="dxa" w:w="3120"/>
+            <w:tcBorders>
+              <w:top w:val="single" w:color="BFBFBF" w:sz="4"/>
+              <w:left w:val="single" w:color="BFBFBF" w:sz="4"/>
+              <w:bottom w:val="single" w:color="BFBFBF" w:sz="4"/>
+              <w:right w:val="single" w:color="BFBFBF" w:sz="4"/>
+            </w:tcBorders>
+            <w:tcMar>
+              <w:top w:type="dxa" w:w="80"/>
+              <w:left w:type="dxa" w:w="120"/>
+              <w:bottom w:type="dxa" w:w="80"/>
+              <w:right w:type="dxa" w:w="120"/>
+            </w:tcMar>
+          </w:tcPr>
+          <w:p>
+            <w:r>
+              <w:rPr>
+                <w:rFonts w:ascii="Malgun Gothic" w:cs="Malgun Gothic" w:eastAsia="Malgun Gothic" w:hAnsi="Malgun Gothic"/>
+                <w:sz w:val="20"/>
+                <w:szCs w:val="20"/>
+              </w:rPr>
+              <w:t xml:space="preserve">대중화권</w:t>
+            </w:r>
+          </w:p>
+        </w:tc>
+        <w:tc>
+          <w:tcPr>
+            <w:tcW w:type="dxa" w:w="3120"/>
+            <w:tcBorders>
+              <w:top w:val="single" w:color="BFBFBF" w:sz="4"/>
+              <w:left w:val="single" w:color="BFBFBF" w:sz="4"/>
+              <w:bottom w:val="single" w:color="BFBFBF" w:sz="4"/>
+              <w:right w:val="single" w:color="BFBFBF" w:sz="4"/>
+            </w:tcBorders>
+            <w:tcMar>
+              <w:top w:type="dxa" w:w="80"/>
+              <w:left w:type="dxa" w:w="120"/>
+              <w:bottom w:type="dxa" w:w="80"/>
+              <w:right w:type="dxa" w:w="120"/>
+            </w:tcMar>
+          </w:tcPr>
+          <w:p>
+            <w:r>
+              <w:rPr>
+                <w:rFonts w:ascii="Malgun Gothic" w:cs="Malgun Gothic" w:eastAsia="Malgun Gothic" w:hAnsi="Malgun Gothic"/>
+                <w:sz w:val="20"/>
+                <w:szCs w:val="20"/>
+              </w:rPr>
+              <w:t xml:space="preserve">FPS (홍콩)</w:t>
             </w:r>
           </w:p>
         </w:tc>
@@ -10060,6 +11156,228 @@
                 <w:szCs w:val="20"/>
               </w:rPr>
               <w:t xml:space="preserve">0%</w:t>
+            </w:r>
+          </w:p>
+        </w:tc>
+      </w:tr>
+      <w:tr>
+        <w:tc>
+          <w:tcPr>
+            <w:tcW w:type="dxa" w:w="3120"/>
+            <w:tcBorders>
+              <w:top w:val="single" w:color="BFBFBF" w:sz="4"/>
+              <w:left w:val="single" w:color="BFBFBF" w:sz="4"/>
+              <w:bottom w:val="single" w:color="BFBFBF" w:sz="4"/>
+              <w:right w:val="single" w:color="BFBFBF" w:sz="4"/>
+            </w:tcBorders>
+            <w:tcMar>
+              <w:top w:type="dxa" w:w="80"/>
+              <w:left w:type="dxa" w:w="120"/>
+              <w:bottom w:type="dxa" w:w="80"/>
+              <w:right w:type="dxa" w:w="120"/>
+            </w:tcMar>
+          </w:tcPr>
+          <w:p>
+            <w:r>
+              <w:rPr>
+                <w:rFonts w:ascii="Malgun Gothic" w:cs="Malgun Gothic" w:eastAsia="Malgun Gothic" w:hAnsi="Malgun Gothic"/>
+                <w:sz w:val="20"/>
+                <w:szCs w:val="20"/>
+              </w:rPr>
+              <w:t xml:space="preserve">동남아</w:t>
+            </w:r>
+          </w:p>
+        </w:tc>
+        <w:tc>
+          <w:tcPr>
+            <w:tcW w:type="dxa" w:w="3120"/>
+            <w:tcBorders>
+              <w:top w:val="single" w:color="BFBFBF" w:sz="4"/>
+              <w:left w:val="single" w:color="BFBFBF" w:sz="4"/>
+              <w:bottom w:val="single" w:color="BFBFBF" w:sz="4"/>
+              <w:right w:val="single" w:color="BFBFBF" w:sz="4"/>
+            </w:tcBorders>
+            <w:tcMar>
+              <w:top w:type="dxa" w:w="80"/>
+              <w:left w:type="dxa" w:w="120"/>
+              <w:bottom w:type="dxa" w:w="80"/>
+              <w:right w:type="dxa" w:w="120"/>
+            </w:tcMar>
+          </w:tcPr>
+          <w:p>
+            <w:r>
+              <w:rPr>
+                <w:rFonts w:ascii="Malgun Gothic" w:cs="Malgun Gothic" w:eastAsia="Malgun Gothic" w:hAnsi="Malgun Gothic"/>
+                <w:sz w:val="20"/>
+                <w:szCs w:val="20"/>
+              </w:rPr>
+              <w:t xml:space="preserve">QR (PromptPay/VNPay)</w:t>
+            </w:r>
+          </w:p>
+        </w:tc>
+        <w:tc>
+          <w:tcPr>
+            <w:tcW w:type="dxa" w:w="3120"/>
+            <w:tcBorders>
+              <w:top w:val="single" w:color="BFBFBF" w:sz="4"/>
+              <w:left w:val="single" w:color="BFBFBF" w:sz="4"/>
+              <w:bottom w:val="single" w:color="BFBFBF" w:sz="4"/>
+              <w:right w:val="single" w:color="BFBFBF" w:sz="4"/>
+            </w:tcBorders>
+            <w:tcMar>
+              <w:top w:type="dxa" w:w="80"/>
+              <w:left w:type="dxa" w:w="120"/>
+              <w:bottom w:type="dxa" w:w="80"/>
+              <w:right w:type="dxa" w:w="120"/>
+            </w:tcMar>
+          </w:tcPr>
+          <w:p>
+            <w:r>
+              <w:rPr>
+                <w:rFonts w:ascii="Malgun Gothic" w:cs="Malgun Gothic" w:eastAsia="Malgun Gothic" w:hAnsi="Malgun Gothic"/>
+                <w:sz w:val="20"/>
+                <w:szCs w:val="20"/>
+              </w:rPr>
+              <w:t xml:space="preserve">0~2.5%</w:t>
+            </w:r>
+          </w:p>
+        </w:tc>
+      </w:tr>
+      <w:tr>
+        <w:tc>
+          <w:tcPr>
+            <w:tcW w:type="dxa" w:w="3120"/>
+            <w:tcBorders>
+              <w:top w:val="single" w:color="BFBFBF" w:sz="4"/>
+              <w:left w:val="single" w:color="BFBFBF" w:sz="4"/>
+              <w:bottom w:val="single" w:color="BFBFBF" w:sz="4"/>
+              <w:right w:val="single" w:color="BFBFBF" w:sz="4"/>
+            </w:tcBorders>
+            <w:tcMar>
+              <w:top w:type="dxa" w:w="80"/>
+              <w:left w:type="dxa" w:w="120"/>
+              <w:bottom w:type="dxa" w:w="80"/>
+              <w:right w:type="dxa" w:w="120"/>
+            </w:tcMar>
+          </w:tcPr>
+          <w:p>
+            <w:r>
+              <w:rPr>
+                <w:rFonts w:ascii="Malgun Gothic" w:cs="Malgun Gothic" w:eastAsia="Malgun Gothic" w:hAnsi="Malgun Gothic"/>
+                <w:sz w:val="20"/>
+                <w:szCs w:val="20"/>
+              </w:rPr>
+              <w:t xml:space="preserve">동남아</w:t>
+            </w:r>
+          </w:p>
+        </w:tc>
+        <w:tc>
+          <w:tcPr>
+            <w:tcW w:type="dxa" w:w="3120"/>
+            <w:tcBorders>
+              <w:top w:val="single" w:color="BFBFBF" w:sz="4"/>
+              <w:left w:val="single" w:color="BFBFBF" w:sz="4"/>
+              <w:bottom w:val="single" w:color="BFBFBF" w:sz="4"/>
+              <w:right w:val="single" w:color="BFBFBF" w:sz="4"/>
+            </w:tcBorders>
+            <w:tcMar>
+              <w:top w:type="dxa" w:w="80"/>
+              <w:left w:type="dxa" w:w="120"/>
+              <w:bottom w:type="dxa" w:w="80"/>
+              <w:right w:type="dxa" w:w="120"/>
+            </w:tcMar>
+          </w:tcPr>
+          <w:p>
+            <w:r>
+              <w:rPr>
+                <w:rFonts w:ascii="Malgun Gothic" w:cs="Malgun Gothic" w:eastAsia="Malgun Gothic" w:hAnsi="Malgun Gothic"/>
+                <w:sz w:val="20"/>
+                <w:szCs w:val="20"/>
+              </w:rPr>
+              <w:t xml:space="preserve">카드 (Xendit)</w:t>
+            </w:r>
+          </w:p>
+        </w:tc>
+        <w:tc>
+          <w:tcPr>
+            <w:tcW w:type="dxa" w:w="3120"/>
+            <w:tcBorders>
+              <w:top w:val="single" w:color="BFBFBF" w:sz="4"/>
+              <w:left w:val="single" w:color="BFBFBF" w:sz="4"/>
+              <w:bottom w:val="single" w:color="BFBFBF" w:sz="4"/>
+              <w:right w:val="single" w:color="BFBFBF" w:sz="4"/>
+            </w:tcBorders>
+            <w:tcMar>
+              <w:top w:type="dxa" w:w="80"/>
+              <w:left w:type="dxa" w:w="120"/>
+              <w:bottom w:type="dxa" w:w="80"/>
+              <w:right w:type="dxa" w:w="120"/>
+            </w:tcMar>
+          </w:tcPr>
+          <w:p>
+            <w:r>
+              <w:rPr>
+                <w:rFonts w:ascii="Malgun Gothic" w:cs="Malgun Gothic" w:eastAsia="Malgun Gothic" w:hAnsi="Malgun Gothic"/>
+                <w:sz w:val="20"/>
+                <w:szCs w:val="20"/>
+              </w:rPr>
+              <w:t xml:space="preserve">3% + $0.30</w:t>
+            </w:r>
+          </w:p>
+        </w:tc>
+      </w:tr>
+      <w:tr>
+        <w:tc>
+          <w:tcPr>
+            <w:tcW w:type="dxa" w:w="3120"/>
+            <w:tcBorders>
+              <w:top w:val="single" w:color="BFBFBF" w:sz="4"/>
+              <w:left w:val="single" w:color="BFBFBF" w:sz="4"/>
+              <w:bottom w:val="single" w:color="BFBFBF" w:sz="4"/>
+              <w:right w:val="single" w:color="BFBFBF" w:sz="4"/>
+            </w:tcBorders>
+            <w:tcMar>
+              <w:top w:type="dxa" w:w="80"/>
+              <w:left w:type="dxa" w:w="120"/>
+              <w:bottom w:type="dxa" w:w="80"/>
+              <w:right w:type="dxa" w:w="120"/>
+            </w:tcMar>
+          </w:tcPr>
+          <w:p>
+            <w:r>
+              <w:rPr>
+                <w:rFonts w:ascii="Malgun Gothic" w:cs="Malgun Gothic" w:eastAsia="Malgun Gothic" w:hAnsi="Malgun Gothic"/>
+                <w:sz w:val="20"/>
+                <w:szCs w:val="20"/>
+              </w:rPr>
+              <w:t xml:space="preserve">SG+MY</w:t>
+            </w:r>
+          </w:p>
+        </w:tc>
+        <w:tc>
+          <w:tcPr>
+            <w:tcW w:type="dxa" w:w="3120"/>
+            <w:tcBorders>
+              <w:top w:val="single" w:color="BFBFBF" w:sz="4"/>
+              <w:left w:val="single" w:color="BFBFBF" w:sz="4"/>
+              <w:bottom w:val="single" w:color="BFBFBF" w:sz="4"/>
+              <w:right w:val="single" w:color="BFBFBF" w:sz="4"/>
+            </w:tcBorders>
+            <w:tcMar>
+              <w:top w:type="dxa" w:w="80"/>
+              <w:left w:type="dxa" w:w="120"/>
+              <w:bottom w:type="dxa" w:w="80"/>
+              <w:right w:type="dxa" w:w="120"/>
+            </w:tcMar>
+          </w:tcPr>
+          <w:p>
+            <w:r>
+              <w:rPr>
+                <w:rFonts w:ascii="Malgun Gothic" w:cs="Malgun Gothic" w:eastAsia="Malgun Gothic" w:hAnsi="Malgun Gothic"/>
+                <w:sz w:val="20"/>
+                <w:szCs w:val="20"/>
+              </w:rPr>
+              <w:t xml:space="preserve">PayNow/DuitNow</w:t>
             </w:r>
           </w:p>
         </w:tc>
@@ -10088,7 +11406,90 @@
                 <w:sz w:val="20"/>
                 <w:szCs w:val="20"/>
               </w:rPr>
-              <w:t xml:space="preserve">+2.4%</w:t>
+              <w:t xml:space="preserve">0%</w:t>
+            </w:r>
+          </w:p>
+        </w:tc>
+      </w:tr>
+      <w:tr>
+        <w:tc>
+          <w:tcPr>
+            <w:tcW w:type="dxa" w:w="3120"/>
+            <w:tcBorders>
+              <w:top w:val="single" w:color="BFBFBF" w:sz="4"/>
+              <w:left w:val="single" w:color="BFBFBF" w:sz="4"/>
+              <w:bottom w:val="single" w:color="BFBFBF" w:sz="4"/>
+              <w:right w:val="single" w:color="BFBFBF" w:sz="4"/>
+            </w:tcBorders>
+            <w:tcMar>
+              <w:top w:type="dxa" w:w="80"/>
+              <w:left w:type="dxa" w:w="120"/>
+              <w:bottom w:type="dxa" w:w="80"/>
+              <w:right w:type="dxa" w:w="120"/>
+            </w:tcMar>
+          </w:tcPr>
+          <w:p>
+            <w:r>
+              <w:rPr>
+                <w:rFonts w:ascii="Malgun Gothic" w:cs="Malgun Gothic" w:eastAsia="Malgun Gothic" w:hAnsi="Malgun Gothic"/>
+                <w:sz w:val="20"/>
+                <w:szCs w:val="20"/>
+              </w:rPr>
+              <w:t xml:space="preserve">SG+MY</w:t>
+            </w:r>
+          </w:p>
+        </w:tc>
+        <w:tc>
+          <w:tcPr>
+            <w:tcW w:type="dxa" w:w="3120"/>
+            <w:tcBorders>
+              <w:top w:val="single" w:color="BFBFBF" w:sz="4"/>
+              <w:left w:val="single" w:color="BFBFBF" w:sz="4"/>
+              <w:bottom w:val="single" w:color="BFBFBF" w:sz="4"/>
+              <w:right w:val="single" w:color="BFBFBF" w:sz="4"/>
+            </w:tcBorders>
+            <w:tcMar>
+              <w:top w:type="dxa" w:w="80"/>
+              <w:left w:type="dxa" w:w="120"/>
+              <w:bottom w:type="dxa" w:w="80"/>
+              <w:right w:type="dxa" w:w="120"/>
+            </w:tcMar>
+          </w:tcPr>
+          <w:p>
+            <w:r>
+              <w:rPr>
+                <w:rFonts w:ascii="Malgun Gothic" w:cs="Malgun Gothic" w:eastAsia="Malgun Gothic" w:hAnsi="Malgun Gothic"/>
+                <w:sz w:val="20"/>
+                <w:szCs w:val="20"/>
+              </w:rPr>
+              <w:t xml:space="preserve">Stripe 카드</w:t>
+            </w:r>
+          </w:p>
+        </w:tc>
+        <w:tc>
+          <w:tcPr>
+            <w:tcW w:type="dxa" w:w="3120"/>
+            <w:tcBorders>
+              <w:top w:val="single" w:color="BFBFBF" w:sz="4"/>
+              <w:left w:val="single" w:color="BFBFBF" w:sz="4"/>
+              <w:bottom w:val="single" w:color="BFBFBF" w:sz="4"/>
+              <w:right w:val="single" w:color="BFBFBF" w:sz="4"/>
+            </w:tcBorders>
+            <w:tcMar>
+              <w:top w:type="dxa" w:w="80"/>
+              <w:left w:type="dxa" w:w="120"/>
+              <w:bottom w:type="dxa" w:w="80"/>
+              <w:right w:type="dxa" w:w="120"/>
+            </w:tcMar>
+          </w:tcPr>
+          <w:p>
+            <w:r>
+              <w:rPr>
+                <w:rFonts w:ascii="Malgun Gothic" w:cs="Malgun Gothic" w:eastAsia="Malgun Gothic" w:hAnsi="Malgun Gothic"/>
+                <w:sz w:val="20"/>
+                <w:szCs w:val="20"/>
+              </w:rPr>
+              <w:t xml:space="preserve">3.4%</w:t>
             </w:r>
           </w:p>
         </w:tc>
@@ -10114,7 +11515,25 @@
           <w:sz w:val="20"/>
           <w:szCs w:val="20"/>
         </w:rPr>
-        <w:t xml:space="preserve">→ 동남아만 다소 압박, 나머지는 안전.</w:t>
+        <w:t xml:space="preserve">→ </w:t>
+      </w:r>
+      <w:r>
+        <w:rPr>
+          <w:rFonts w:ascii="Malgun Gothic" w:cs="Malgun Gothic" w:eastAsia="Malgun Gothic" w:hAnsi="Malgun Gothic"/>
+          <w:b/>
+          <w:bCs/>
+          <w:sz w:val="20"/>
+          <w:szCs w:val="20"/>
+        </w:rPr>
+        <w:t xml:space="preserve">고객은 결제수단 선택으로 추가 부담 최소화 가능</w:t>
+      </w:r>
+      <w:r>
+        <w:rPr>
+          <w:rFonts w:ascii="Malgun Gothic" w:cs="Malgun Gothic" w:eastAsia="Malgun Gothic" w:hAnsi="Malgun Gothic"/>
+          <w:sz w:val="20"/>
+          <w:szCs w:val="20"/>
+        </w:rPr>
+        <w:t xml:space="preserve"> (송금/QR 선택 시 0%)</w:t>
       </w:r>
     </w:p>
     <w:p>
@@ -10874,7 +12293,7 @@
         <w:pStyle w:val="ListParagraph"/>
         <w:numPr>
           <w:ilvl w:val="0"/>
-          <w:numId w:val="2"/>
+          <w:numId w:val="3"/>
         </w:numPr>
         <w:spacing w:after="60"/>
       </w:pPr>
@@ -10887,6 +12306,160 @@
           <w:szCs w:val="20"/>
         </w:rPr>
         <w:t xml:space="preserve">Model C 하이브리드 수금 모델 채택</w:t>
+      </w:r>
+    </w:p>
+    <w:p>
+      <w:pPr>
+        <w:pStyle w:val="ListParagraph"/>
+        <w:numPr>
+          <w:ilvl w:val="0"/>
+          <w:numId w:val="3"/>
+        </w:numPr>
+        <w:spacing w:after="60"/>
+      </w:pPr>
+      <w:r>
+        <w:rPr>
+          <w:rFonts w:ascii="Malgun Gothic" w:cs="Malgun Gothic" w:eastAsia="Malgun Gothic" w:hAnsi="Malgun Gothic"/>
+          <w:b/>
+          <w:bCs/>
+          <w:sz w:val="20"/>
+          <w:szCs w:val="20"/>
+        </w:rPr>
+        <w:t xml:space="preserve">Phase 1 즉시 도입 승인</w:t>
+      </w:r>
+      <w:r>
+        <w:rPr>
+          <w:rFonts w:ascii="Malgun Gothic" w:cs="Malgun Gothic" w:eastAsia="Malgun Gothic" w:hAnsi="Malgun Gothic"/>
+          <w:sz w:val="20"/>
+          <w:szCs w:val="20"/>
+        </w:rPr>
+        <w:t xml:space="preserve"> — 한국 가상계좌 + PayNow + PCI-DSS 점검</w:t>
+      </w:r>
+    </w:p>
+    <w:p>
+      <w:pPr>
+        <w:pStyle w:val="ListParagraph"/>
+        <w:numPr>
+          <w:ilvl w:val="0"/>
+          <w:numId w:val="3"/>
+        </w:numPr>
+        <w:spacing w:after="60"/>
+      </w:pPr>
+      <w:r>
+        <w:rPr>
+          <w:rFonts w:ascii="Malgun Gothic" w:cs="Malgun Gothic" w:eastAsia="Malgun Gothic" w:hAnsi="Malgun Gothic"/>
+          <w:b/>
+          <w:bCs/>
+          <w:sz w:val="20"/>
+          <w:szCs w:val="20"/>
+        </w:rPr>
+        <w:t xml:space="preserve">홍콩 지사 오픈 일정 확정</w:t>
+      </w:r>
+      <w:r>
+        <w:rPr>
+          <w:rFonts w:ascii="Malgun Gothic" w:cs="Malgun Gothic" w:eastAsia="Malgun Gothic" w:hAnsi="Malgun Gothic"/>
+          <w:sz w:val="20"/>
+          <w:szCs w:val="20"/>
+        </w:rPr>
+        <w:t xml:space="preserve"> (Phase 2 트리거)</w:t>
+      </w:r>
+    </w:p>
+    <w:p>
+      <w:pPr>
+        <w:pStyle w:val="ListParagraph"/>
+        <w:numPr>
+          <w:ilvl w:val="0"/>
+          <w:numId w:val="3"/>
+        </w:numPr>
+        <w:spacing w:after="60"/>
+      </w:pPr>
+      <w:r>
+        <w:rPr>
+          <w:rFonts w:ascii="Malgun Gothic" w:cs="Malgun Gothic" w:eastAsia="Malgun Gothic" w:hAnsi="Malgun Gothic"/>
+          <w:b/>
+          <w:bCs/>
+          <w:sz w:val="20"/>
+          <w:szCs w:val="20"/>
+        </w:rPr>
+        <w:t xml:space="preserve">각 지사 → SG 본사 내부 정산 회계 정책 수립</w:t>
+      </w:r>
+      <w:r>
+        <w:rPr>
+          <w:rFonts w:ascii="Malgun Gothic" w:cs="Malgun Gothic" w:eastAsia="Malgun Gothic" w:hAnsi="Malgun Gothic"/>
+          <w:sz w:val="20"/>
+          <w:szCs w:val="20"/>
+        </w:rPr>
+        <w:t xml:space="preserve"> (CFO)</w:t>
+      </w:r>
+    </w:p>
+    <w:p>
+      <w:pPr>
+        <w:pStyle w:val="ListParagraph"/>
+        <w:numPr>
+          <w:ilvl w:val="0"/>
+          <w:numId w:val="3"/>
+        </w:numPr>
+        <w:spacing w:after="60"/>
+      </w:pPr>
+      <w:r>
+        <w:rPr>
+          <w:rFonts w:ascii="Malgun Gothic" w:cs="Malgun Gothic" w:eastAsia="Malgun Gothic" w:hAnsi="Malgun Gothic"/>
+          <w:b/>
+          <w:bCs/>
+          <w:sz w:val="20"/>
+          <w:szCs w:val="20"/>
+        </w:rPr>
+        <w:t xml:space="preserve">권역별 영업팀 컨택 착수</w:t>
+      </w:r>
+      <w:r>
+        <w:rPr>
+          <w:rFonts w:ascii="Malgun Gothic" w:cs="Malgun Gothic" w:eastAsia="Malgun Gothic" w:hAnsi="Malgun Gothic"/>
+          <w:sz w:val="20"/>
+          <w:szCs w:val="20"/>
+        </w:rPr>
+        <w:t xml:space="preserve"> (6개 항목)</w:t>
+      </w:r>
+    </w:p>
+    <w:p>
+      <w:r>
+        <w:t xml:space="preserve"/>
+      </w:r>
+    </w:p>
+    <w:p>
+      <w:pPr>
+        <w:pBdr>
+          <w:bottom w:val="single" w:color="999999" w:sz="6" w:space="1"/>
+        </w:pBdr>
+        <w:spacing w:after="100" w:before="100"/>
+      </w:pPr>
+      <w:r>
+        <w:t xml:space="preserve"/>
+      </w:r>
+    </w:p>
+    <w:p>
+      <w:r>
+        <w:t xml:space="preserve"/>
+      </w:r>
+    </w:p>
+    <w:p>
+      <w:pPr>
+        <w:pStyle w:val="Heading2"/>
+        <w:spacing w:after="150" w:before="300"/>
+      </w:pPr>
+      <w:r>
+        <w:rPr>
+          <w:rFonts w:ascii="Malgun Gothic" w:cs="Malgun Gothic" w:eastAsia="Malgun Gothic" w:hAnsi="Malgun Gothic"/>
+          <w:b/>
+          <w:bCs/>
+          <w:sz w:val="30"/>
+          <w:szCs w:val="30"/>
+        </w:rPr>
+        <w:t xml:space="preserve">📂 관련 문서</w:t>
+      </w:r>
+    </w:p>
+    <w:p>
+      <w:r>
+        <w:t xml:space="preserve"/>
       </w:r>
     </w:p>
     <w:p>
@@ -10900,21 +12473,20 @@
       </w:pPr>
       <w:r>
         <w:rPr>
-          <w:rFonts w:ascii="Malgun Gothic" w:cs="Malgun Gothic" w:eastAsia="Malgun Gothic" w:hAnsi="Malgun Gothic"/>
-          <w:b/>
-          <w:bCs/>
-          <w:sz w:val="20"/>
-          <w:szCs w:val="20"/>
-        </w:rPr>
-        <w:t xml:space="preserve">Phase 1 즉시 도입 승인</w:t>
-      </w:r>
-      <w:r>
-        <w:rPr>
-          <w:rFonts w:ascii="Malgun Gothic" w:cs="Malgun Gothic" w:eastAsia="Malgun Gothic" w:hAnsi="Malgun Gothic"/>
-          <w:sz w:val="20"/>
-          <w:szCs w:val="20"/>
-        </w:rPr>
-        <w:t xml:space="preserve"> — 한국 가상계좌 + PayNow + PCI-DSS 점검</w:t>
+          <w:rFonts w:ascii="Consolas" w:cs="Consolas" w:eastAsia="Consolas" w:hAnsi="Consolas"/>
+          <w:sz w:val="18"/>
+          <w:szCs w:val="18"/>
+          <w:shd w:fill="F0F0F0" w:val="clear"/>
+        </w:rPr>
+        <w:t xml:space="preserve">Market_Research_PG_Models_2026-05-08.md</w:t>
+      </w:r>
+      <w:r>
+        <w:rPr>
+          <w:rFonts w:ascii="Malgun Gothic" w:cs="Malgun Gothic" w:eastAsia="Malgun Gothic" w:hAnsi="Malgun Gothic"/>
+          <w:sz w:val="20"/>
+          <w:szCs w:val="20"/>
+        </w:rPr>
+        <w:t xml:space="preserve"> (15개 공급사 비교)</w:t>
       </w:r>
     </w:p>
     <w:p>
@@ -10928,21 +12500,20 @@
       </w:pPr>
       <w:r>
         <w:rPr>
-          <w:rFonts w:ascii="Malgun Gothic" w:cs="Malgun Gothic" w:eastAsia="Malgun Gothic" w:hAnsi="Malgun Gothic"/>
-          <w:b/>
-          <w:bCs/>
-          <w:sz w:val="20"/>
-          <w:szCs w:val="20"/>
-        </w:rPr>
-        <w:t xml:space="preserve">홍콩 지사 오픈 일정 확정</w:t>
-      </w:r>
-      <w:r>
-        <w:rPr>
-          <w:rFonts w:ascii="Malgun Gothic" w:cs="Malgun Gothic" w:eastAsia="Malgun Gothic" w:hAnsi="Malgun Gothic"/>
-          <w:sz w:val="20"/>
-          <w:szCs w:val="20"/>
-        </w:rPr>
-        <w:t xml:space="preserve"> (Phase 2 트리거)</w:t>
+          <w:rFonts w:ascii="Consolas" w:cs="Consolas" w:eastAsia="Consolas" w:hAnsi="Consolas"/>
+          <w:sz w:val="18"/>
+          <w:szCs w:val="18"/>
+          <w:shd w:fill="F0F0F0" w:val="clear"/>
+        </w:rPr>
+        <w:t xml:space="preserve">Settlement_CEO_Critical_Update_2026-05-08.md</w:t>
+      </w:r>
+      <w:r>
+        <w:rPr>
+          <w:rFonts w:ascii="Malgun Gothic" w:cs="Malgun Gothic" w:eastAsia="Malgun Gothic" w:hAnsi="Malgun Gothic"/>
+          <w:sz w:val="20"/>
+          <w:szCs w:val="20"/>
+        </w:rPr>
+        <w:t xml:space="preserve"> (마진 4% 재검토)</w:t>
       </w:r>
     </w:p>
     <w:p>
@@ -10956,21 +12527,20 @@
       </w:pPr>
       <w:r>
         <w:rPr>
-          <w:rFonts w:ascii="Malgun Gothic" w:cs="Malgun Gothic" w:eastAsia="Malgun Gothic" w:hAnsi="Malgun Gothic"/>
-          <w:b/>
-          <w:bCs/>
-          <w:sz w:val="20"/>
-          <w:szCs w:val="20"/>
-        </w:rPr>
-        <w:t xml:space="preserve">각 지사 → SG 본사 내부 정산 회계 정책 수립</w:t>
-      </w:r>
-      <w:r>
-        <w:rPr>
-          <w:rFonts w:ascii="Malgun Gothic" w:cs="Malgun Gothic" w:eastAsia="Malgun Gothic" w:hAnsi="Malgun Gothic"/>
-          <w:sz w:val="20"/>
-          <w:szCs w:val="20"/>
-        </w:rPr>
-        <w:t xml:space="preserve"> (CFO)</w:t>
+          <w:rFonts w:ascii="Consolas" w:cs="Consolas" w:eastAsia="Consolas" w:hAnsi="Consolas"/>
+          <w:sz w:val="18"/>
+          <w:szCs w:val="18"/>
+          <w:shd w:fill="F0F0F0" w:val="clear"/>
+        </w:rPr>
+        <w:t xml:space="preserve">Settlement_CEO_Inspection_2026-05-07.md</w:t>
+      </w:r>
+      <w:r>
+        <w:rPr>
+          <w:rFonts w:ascii="Malgun Gothic" w:cs="Malgun Gothic" w:eastAsia="Malgun Gothic" w:hAnsi="Malgun Gothic"/>
+          <w:sz w:val="20"/>
+          <w:szCs w:val="20"/>
+        </w:rPr>
+        <w:t xml:space="preserve"> (1단계 결재 8건)</w:t>
       </w:r>
     </w:p>
     <w:p>
@@ -10984,90 +12554,20 @@
       </w:pPr>
       <w:r>
         <w:rPr>
-          <w:rFonts w:ascii="Malgun Gothic" w:cs="Malgun Gothic" w:eastAsia="Malgun Gothic" w:hAnsi="Malgun Gothic"/>
-          <w:b/>
-          <w:bCs/>
-          <w:sz w:val="20"/>
-          <w:szCs w:val="20"/>
-        </w:rPr>
-        <w:t xml:space="preserve">권역별 영업팀 컨택 착수</w:t>
-      </w:r>
-      <w:r>
-        <w:rPr>
-          <w:rFonts w:ascii="Malgun Gothic" w:cs="Malgun Gothic" w:eastAsia="Malgun Gothic" w:hAnsi="Malgun Gothic"/>
-          <w:sz w:val="20"/>
-          <w:szCs w:val="20"/>
-        </w:rPr>
-        <w:t xml:space="preserve"> (6개 항목)</w:t>
-      </w:r>
-    </w:p>
-    <w:p>
-      <w:r>
-        <w:t xml:space="preserve"/>
-      </w:r>
-    </w:p>
-    <w:p>
-      <w:pPr>
-        <w:pBdr>
-          <w:bottom w:val="single" w:color="999999" w:sz="6" w:space="1"/>
-        </w:pBdr>
-        <w:spacing w:after="100" w:before="100"/>
-      </w:pPr>
-      <w:r>
-        <w:t xml:space="preserve"/>
-      </w:r>
-    </w:p>
-    <w:p>
-      <w:r>
-        <w:t xml:space="preserve"/>
-      </w:r>
-    </w:p>
-    <w:p>
-      <w:pPr>
-        <w:pStyle w:val="Heading2"/>
-        <w:spacing w:after="150" w:before="300"/>
-      </w:pPr>
-      <w:r>
-        <w:rPr>
-          <w:rFonts w:ascii="Malgun Gothic" w:cs="Malgun Gothic" w:eastAsia="Malgun Gothic" w:hAnsi="Malgun Gothic"/>
-          <w:b/>
-          <w:bCs/>
-          <w:sz w:val="30"/>
-          <w:szCs w:val="30"/>
-        </w:rPr>
-        <w:t xml:space="preserve">📂 관련 문서</w:t>
-      </w:r>
-    </w:p>
-    <w:p>
-      <w:r>
-        <w:t xml:space="preserve"/>
-      </w:r>
-    </w:p>
-    <w:p>
-      <w:pPr>
-        <w:pStyle w:val="ListParagraph"/>
-        <w:numPr>
-          <w:ilvl w:val="0"/>
-          <w:numId w:val="3"/>
-        </w:numPr>
-        <w:spacing w:after="60"/>
-      </w:pPr>
-      <w:r>
-        <w:rPr>
           <w:rFonts w:ascii="Consolas" w:cs="Consolas" w:eastAsia="Consolas" w:hAnsi="Consolas"/>
           <w:sz w:val="18"/>
           <w:szCs w:val="18"/>
           <w:shd w:fill="F0F0F0" w:val="clear"/>
         </w:rPr>
-        <w:t xml:space="preserve">Market_Research_PG_Models_2026-05-08.md</w:t>
-      </w:r>
-      <w:r>
-        <w:rPr>
-          <w:rFonts w:ascii="Malgun Gothic" w:cs="Malgun Gothic" w:eastAsia="Malgun Gothic" w:hAnsi="Malgun Gothic"/>
-          <w:sz w:val="20"/>
-          <w:szCs w:val="20"/>
-        </w:rPr>
-        <w:t xml:space="preserve"> (15개 공급사 비교)</w:t>
+        <w:t xml:space="preserve">Settlement_CEO_Inspection_2026-05-08.md</w:t>
+      </w:r>
+      <w:r>
+        <w:rPr>
+          <w:rFonts w:ascii="Malgun Gothic" w:cs="Malgun Gothic" w:eastAsia="Malgun Gothic" w:hAnsi="Malgun Gothic"/>
+          <w:sz w:val="20"/>
+          <w:szCs w:val="20"/>
+        </w:rPr>
+        <w:t xml:space="preserve"> (2단계 Sage 8건)</w:t>
       </w:r>
     </w:p>
     <w:p>
@@ -11075,88 +12575,7 @@
         <w:pStyle w:val="ListParagraph"/>
         <w:numPr>
           <w:ilvl w:val="0"/>
-          <w:numId w:val="3"/>
-        </w:numPr>
-        <w:spacing w:after="60"/>
-      </w:pPr>
-      <w:r>
-        <w:rPr>
-          <w:rFonts w:ascii="Consolas" w:cs="Consolas" w:eastAsia="Consolas" w:hAnsi="Consolas"/>
-          <w:sz w:val="18"/>
-          <w:szCs w:val="18"/>
-          <w:shd w:fill="F0F0F0" w:val="clear"/>
-        </w:rPr>
-        <w:t xml:space="preserve">Settlement_CEO_Critical_Update_2026-05-08.md</w:t>
-      </w:r>
-      <w:r>
-        <w:rPr>
-          <w:rFonts w:ascii="Malgun Gothic" w:cs="Malgun Gothic" w:eastAsia="Malgun Gothic" w:hAnsi="Malgun Gothic"/>
-          <w:sz w:val="20"/>
-          <w:szCs w:val="20"/>
-        </w:rPr>
-        <w:t xml:space="preserve"> (마진 4% 재검토)</w:t>
-      </w:r>
-    </w:p>
-    <w:p>
-      <w:pPr>
-        <w:pStyle w:val="ListParagraph"/>
-        <w:numPr>
-          <w:ilvl w:val="0"/>
-          <w:numId w:val="3"/>
-        </w:numPr>
-        <w:spacing w:after="60"/>
-      </w:pPr>
-      <w:r>
-        <w:rPr>
-          <w:rFonts w:ascii="Consolas" w:cs="Consolas" w:eastAsia="Consolas" w:hAnsi="Consolas"/>
-          <w:sz w:val="18"/>
-          <w:szCs w:val="18"/>
-          <w:shd w:fill="F0F0F0" w:val="clear"/>
-        </w:rPr>
-        <w:t xml:space="preserve">Settlement_CEO_Inspection_2026-05-07.md</w:t>
-      </w:r>
-      <w:r>
-        <w:rPr>
-          <w:rFonts w:ascii="Malgun Gothic" w:cs="Malgun Gothic" w:eastAsia="Malgun Gothic" w:hAnsi="Malgun Gothic"/>
-          <w:sz w:val="20"/>
-          <w:szCs w:val="20"/>
-        </w:rPr>
-        <w:t xml:space="preserve"> (1단계 결재 8건)</w:t>
-      </w:r>
-    </w:p>
-    <w:p>
-      <w:pPr>
-        <w:pStyle w:val="ListParagraph"/>
-        <w:numPr>
-          <w:ilvl w:val="0"/>
-          <w:numId w:val="3"/>
-        </w:numPr>
-        <w:spacing w:after="60"/>
-      </w:pPr>
-      <w:r>
-        <w:rPr>
-          <w:rFonts w:ascii="Consolas" w:cs="Consolas" w:eastAsia="Consolas" w:hAnsi="Consolas"/>
-          <w:sz w:val="18"/>
-          <w:szCs w:val="18"/>
-          <w:shd w:fill="F0F0F0" w:val="clear"/>
-        </w:rPr>
-        <w:t xml:space="preserve">Settlement_CEO_Inspection_2026-05-08.md</w:t>
-      </w:r>
-      <w:r>
-        <w:rPr>
-          <w:rFonts w:ascii="Malgun Gothic" w:cs="Malgun Gothic" w:eastAsia="Malgun Gothic" w:hAnsi="Malgun Gothic"/>
-          <w:sz w:val="20"/>
-          <w:szCs w:val="20"/>
-        </w:rPr>
-        <w:t xml:space="preserve"> (2단계 Sage 8건)</w:t>
-      </w:r>
-    </w:p>
-    <w:p>
-      <w:pPr>
-        <w:pStyle w:val="ListParagraph"/>
-        <w:numPr>
-          <w:ilvl w:val="0"/>
-          <w:numId w:val="3"/>
+          <w:numId w:val="2"/>
         </w:numPr>
         <w:spacing w:after="60"/>
       </w:pPr>
@@ -11416,13 +12835,13 @@
     </w:lvlOverride>
   </w:num>
   <w:num w:numId="2">
-    <w:abstractNumId w:val="3"/>
+    <w:abstractNumId w:val="2"/>
     <w:lvlOverride w:ilvl="0">
       <w:startOverride w:val="1"/>
     </w:lvlOverride>
   </w:num>
   <w:num w:numId="3">
-    <w:abstractNumId w:val="2"/>
+    <w:abstractNumId w:val="3"/>
     <w:lvlOverride w:ilvl="0">
       <w:startOverride w:val="1"/>
     </w:lvlOverride>

</xml_diff>